<commit_message>
Feb 26 Update 1.02
</commit_message>
<xml_diff>
--- a/Documentation/Massive Fullstack Course.docx
+++ b/Documentation/Massive Fullstack Course.docx
@@ -160,7 +160,27 @@
         </w:numPr>
       </w:pPr>
       <w:r>
-        <w:t>For example: &lt;opening tag&gt; element’s contents&lt;/closing tag&gt;</w:t>
+        <w:t>For example: &lt;</w:t>
+      </w:r>
+      <w:r>
+        <w:rPr>
+          <w:b/>
+          <w:bCs/>
+        </w:rPr>
+        <w:t>opening tag</w:t>
+      </w:r>
+      <w:r>
+        <w:t>&gt; element’s contents</w:t>
+      </w:r>
+      <w:r>
+        <w:rPr>
+          <w:b/>
+          <w:bCs/>
+        </w:rPr>
+        <w:t>&lt;/closing tag</w:t>
+      </w:r>
+      <w:r>
+        <w:t>&gt;</w:t>
       </w:r>
     </w:p>
     <w:p>
@@ -181,7 +201,27 @@
         <w:t>these</w:t>
       </w:r>
       <w:r>
-        <w:t xml:space="preserve"> are called “self-closing” tags, or “void elements”.</w:t>
+        <w:t xml:space="preserve"> are called “</w:t>
+      </w:r>
+      <w:r>
+        <w:rPr>
+          <w:b/>
+          <w:bCs/>
+        </w:rPr>
+        <w:t>self-closing</w:t>
+      </w:r>
+      <w:r>
+        <w:t>” tags, or “</w:t>
+      </w:r>
+      <w:r>
+        <w:rPr>
+          <w:b/>
+          <w:bCs/>
+        </w:rPr>
+        <w:t>void elements</w:t>
+      </w:r>
+      <w:r>
+        <w:t>”.</w:t>
       </w:r>
     </w:p>
     <w:p>
@@ -343,7 +383,27 @@
           <w:lang w:eastAsia="en-GB"/>
           <w14:ligatures w14:val="none"/>
         </w:rPr>
-        <w:t>to be HTML.</w:t>
+        <w:t>to be HTML</w:t>
+      </w:r>
+      <w:r>
+        <w:rPr>
+          <w:rFonts w:ascii="Times New Roman" w:eastAsia="Times New Roman" w:hAnsi="Times New Roman" w:cs="Times New Roman"/>
+          <w:color w:val="000000"/>
+          <w:kern w:val="0"/>
+          <w:lang w:eastAsia="en-GB"/>
+          <w14:ligatures w14:val="none"/>
+        </w:rPr>
+        <w:t>5</w:t>
+      </w:r>
+      <w:r>
+        <w:rPr>
+          <w:rFonts w:ascii="Times New Roman" w:eastAsia="Times New Roman" w:hAnsi="Times New Roman" w:cs="Times New Roman"/>
+          <w:color w:val="000000"/>
+          <w:kern w:val="0"/>
+          <w:lang w:eastAsia="en-GB"/>
+          <w14:ligatures w14:val="none"/>
+        </w:rPr>
+        <w:t>.</w:t>
       </w:r>
     </w:p>
     <w:p>
@@ -2194,7 +2254,7 @@
           <w:sz w:val="36"/>
           <w:szCs w:val="36"/>
         </w:rPr>
-        <w:t xml:space="preserve">Intro to CSS </w:t>
+        <w:t>Intro to CSS</w:t>
       </w:r>
     </w:p>
     <w:p>

</xml_diff>

<commit_message>
Updated course, redid the portfolio's CSS
</commit_message>
<xml_diff>
--- a/Documentation/Massive Fullstack Course.docx
+++ b/Documentation/Massive Fullstack Course.docx
@@ -1,6 +1,6 @@
 
 <file path=word/document.xml><?xml version="1.0" encoding="utf-8"?>
-<w:document xmlns:wpc="http://schemas.microsoft.com/office/word/2010/wordprocessingCanvas" xmlns:cx="http://schemas.microsoft.com/office/drawing/2014/chartex" xmlns:cx1="http://schemas.microsoft.com/office/drawing/2015/9/8/chartex" xmlns:cx2="http://schemas.microsoft.com/office/drawing/2015/10/21/chartex" xmlns:cx3="http://schemas.microsoft.com/office/drawing/2016/5/9/chartex" xmlns:cx4="http://schemas.microsoft.com/office/drawing/2016/5/10/chartex" xmlns:cx5="http://schemas.microsoft.com/office/drawing/2016/5/11/chartex" xmlns:cx6="http://schemas.microsoft.com/office/drawing/2016/5/12/chartex" xmlns:cx7="http://schemas.microsoft.com/office/drawing/2016/5/13/chartex" xmlns:cx8="http://schemas.microsoft.com/office/drawing/2016/5/14/chartex" xmlns:mc="http://schemas.openxmlformats.org/markup-compatibility/2006" xmlns:aink="http://schemas.microsoft.com/office/drawing/2016/ink" xmlns:am3d="http://schemas.microsoft.com/office/drawing/2017/model3d" xmlns:o="urn:schemas-microsoft-com:office:office" xmlns:r="http://schemas.openxmlformats.org/officeDocument/2006/relationships" xmlns:m="http://schemas.openxmlformats.org/officeDocument/2006/math" xmlns:v="urn:schemas-microsoft-com:vml" xmlns:wp14="http://schemas.microsoft.com/office/word/2010/wordprocessingDrawing" xmlns:wp="http://schemas.openxmlformats.org/drawingml/2006/wordprocessingDrawing" xmlns:w10="urn:schemas-microsoft-com:office:word" xmlns:w="http://schemas.openxmlformats.org/wordprocessingml/2006/main" xmlns:w14="http://schemas.microsoft.com/office/word/2010/wordml" xmlns:w15="http://schemas.microsoft.com/office/word/2012/wordml" xmlns:w16cid="http://schemas.microsoft.com/office/word/2016/wordml/cid" xmlns:w16se="http://schemas.microsoft.com/office/word/2015/wordml/symex" xmlns:wpg="http://schemas.microsoft.com/office/word/2010/wordprocessingGroup" xmlns:wpi="http://schemas.microsoft.com/office/word/2010/wordprocessingInk" xmlns:wne="http://schemas.microsoft.com/office/word/2006/wordml" xmlns:wps="http://schemas.microsoft.com/office/word/2010/wordprocessingShape" mc:Ignorable="w14 w15 w16se w16cid wp14">
+<w:document xmlns:wpc="http://schemas.microsoft.com/office/word/2010/wordprocessingCanvas" xmlns:cx="http://schemas.microsoft.com/office/drawing/2014/chartex" xmlns:cx1="http://schemas.microsoft.com/office/drawing/2015/9/8/chartex" xmlns:cx2="http://schemas.microsoft.com/office/drawing/2015/10/21/chartex" xmlns:cx3="http://schemas.microsoft.com/office/drawing/2016/5/9/chartex" xmlns:cx4="http://schemas.microsoft.com/office/drawing/2016/5/10/chartex" xmlns:cx5="http://schemas.microsoft.com/office/drawing/2016/5/11/chartex" xmlns:cx6="http://schemas.microsoft.com/office/drawing/2016/5/12/chartex" xmlns:cx7="http://schemas.microsoft.com/office/drawing/2016/5/13/chartex" xmlns:cx8="http://schemas.microsoft.com/office/drawing/2016/5/14/chartex" xmlns:mc="http://schemas.openxmlformats.org/markup-compatibility/2006" xmlns:aink="http://schemas.microsoft.com/office/drawing/2016/ink" xmlns:am3d="http://schemas.microsoft.com/office/drawing/2017/model3d" xmlns:o="urn:schemas-microsoft-com:office:office" xmlns:oel="http://schemas.microsoft.com/office/2019/extlst" xmlns:r="http://schemas.openxmlformats.org/officeDocument/2006/relationships" xmlns:m="http://schemas.openxmlformats.org/officeDocument/2006/math" xmlns:v="urn:schemas-microsoft-com:vml" xmlns:wp14="http://schemas.microsoft.com/office/word/2010/wordprocessingDrawing" xmlns:wp="http://schemas.openxmlformats.org/drawingml/2006/wordprocessingDrawing" xmlns:w10="urn:schemas-microsoft-com:office:word" xmlns:w="http://schemas.openxmlformats.org/wordprocessingml/2006/main" xmlns:w14="http://schemas.microsoft.com/office/word/2010/wordml" xmlns:w15="http://schemas.microsoft.com/office/word/2012/wordml" xmlns:w16cex="http://schemas.microsoft.com/office/word/2018/wordml/cex" xmlns:w16cid="http://schemas.microsoft.com/office/word/2016/wordml/cid" xmlns:w16="http://schemas.microsoft.com/office/word/2018/wordml" xmlns:w16du="http://schemas.microsoft.com/office/word/2023/wordml/word16du" xmlns:w16sdtdh="http://schemas.microsoft.com/office/word/2020/wordml/sdtdatahash" xmlns:w16sdtfl="http://schemas.microsoft.com/office/word/2024/wordml/sdtformatlock" xmlns:w16se="http://schemas.microsoft.com/office/word/2015/wordml/symex" xmlns:wpg="http://schemas.microsoft.com/office/word/2010/wordprocessingGroup" xmlns:wpi="http://schemas.microsoft.com/office/word/2010/wordprocessingInk" xmlns:wne="http://schemas.microsoft.com/office/word/2006/wordml" xmlns:wps="http://schemas.microsoft.com/office/word/2010/wordprocessingShape" mc:Ignorable="w14 w15 w16se w16cid w16 w16cex w16sdtdh w16sdtfl w16du wp14">
   <w:body>
     <w:p>
       <w:pPr>
@@ -29,7 +29,7 @@
     </w:p>
     <w:p>
       <w:pPr>
-        <w:pStyle w:val="Paragraphedeliste"/>
+        <w:pStyle w:val="ListParagraph"/>
         <w:numPr>
           <w:ilvl w:val="1"/>
           <w:numId w:val="3"/>
@@ -61,7 +61,7 @@
     </w:p>
     <w:p>
       <w:pPr>
-        <w:pStyle w:val="Paragraphedeliste"/>
+        <w:pStyle w:val="ListParagraph"/>
         <w:numPr>
           <w:ilvl w:val="1"/>
           <w:numId w:val="3"/>
@@ -89,7 +89,7 @@
     </w:p>
     <w:p>
       <w:pPr>
-        <w:pStyle w:val="Paragraphedeliste"/>
+        <w:pStyle w:val="ListParagraph"/>
         <w:numPr>
           <w:ilvl w:val="0"/>
           <w:numId w:val="3"/>
@@ -115,7 +115,7 @@
     </w:p>
     <w:p>
       <w:pPr>
-        <w:pStyle w:val="Paragraphedeliste"/>
+        <w:pStyle w:val="ListParagraph"/>
         <w:numPr>
           <w:ilvl w:val="0"/>
           <w:numId w:val="5"/>
@@ -141,7 +141,7 @@
     </w:p>
     <w:p>
       <w:pPr>
-        <w:pStyle w:val="Paragraphedeliste"/>
+        <w:pStyle w:val="ListParagraph"/>
         <w:numPr>
           <w:ilvl w:val="1"/>
           <w:numId w:val="3"/>
@@ -153,7 +153,7 @@
     </w:p>
     <w:p>
       <w:pPr>
-        <w:pStyle w:val="Paragraphedeliste"/>
+        <w:pStyle w:val="ListParagraph"/>
         <w:numPr>
           <w:ilvl w:val="2"/>
           <w:numId w:val="3"/>
@@ -185,7 +185,7 @@
     </w:p>
     <w:p>
       <w:pPr>
-        <w:pStyle w:val="Paragraphedeliste"/>
+        <w:pStyle w:val="ListParagraph"/>
         <w:numPr>
           <w:ilvl w:val="2"/>
           <w:numId w:val="3"/>
@@ -226,7 +226,7 @@
     </w:p>
     <w:p>
       <w:pPr>
-        <w:pStyle w:val="Paragraphedeliste"/>
+        <w:pStyle w:val="ListParagraph"/>
         <w:numPr>
           <w:ilvl w:val="1"/>
           <w:numId w:val="3"/>
@@ -260,7 +260,7 @@
     </w:p>
     <w:p>
       <w:pPr>
-        <w:pStyle w:val="Paragraphedeliste"/>
+        <w:pStyle w:val="ListParagraph"/>
         <w:numPr>
           <w:ilvl w:val="1"/>
           <w:numId w:val="3"/>
@@ -339,7 +339,7 @@
     </w:p>
     <w:p>
       <w:pPr>
-        <w:pStyle w:val="Paragraphedeliste"/>
+        <w:pStyle w:val="ListParagraph"/>
         <w:numPr>
           <w:ilvl w:val="1"/>
           <w:numId w:val="3"/>
@@ -351,7 +351,7 @@
     </w:p>
     <w:p>
       <w:pPr>
-        <w:pStyle w:val="Paragraphedeliste"/>
+        <w:pStyle w:val="ListParagraph"/>
         <w:numPr>
           <w:ilvl w:val="2"/>
           <w:numId w:val="3"/>
@@ -420,7 +420,7 @@
     </w:p>
     <w:p>
       <w:pPr>
-        <w:pStyle w:val="Paragraphedeliste"/>
+        <w:pStyle w:val="ListParagraph"/>
         <w:numPr>
           <w:ilvl w:val="2"/>
           <w:numId w:val="3"/>
@@ -459,7 +459,7 @@
     </w:p>
     <w:p>
       <w:pPr>
-        <w:pStyle w:val="Paragraphedeliste"/>
+        <w:pStyle w:val="ListParagraph"/>
         <w:numPr>
           <w:ilvl w:val="2"/>
           <w:numId w:val="3"/>
@@ -548,7 +548,7 @@
     </w:p>
     <w:p>
       <w:pPr>
-        <w:pStyle w:val="Paragraphedeliste"/>
+        <w:pStyle w:val="ListParagraph"/>
         <w:numPr>
           <w:ilvl w:val="2"/>
           <w:numId w:val="3"/>
@@ -659,7 +659,7 @@
     </w:p>
     <w:p>
       <w:pPr>
-        <w:pStyle w:val="Paragraphedeliste"/>
+        <w:pStyle w:val="ListParagraph"/>
         <w:numPr>
           <w:ilvl w:val="2"/>
           <w:numId w:val="3"/>
@@ -718,7 +718,7 @@
     </w:p>
     <w:p>
       <w:pPr>
-        <w:pStyle w:val="Paragraphedeliste"/>
+        <w:pStyle w:val="ListParagraph"/>
         <w:numPr>
           <w:ilvl w:val="2"/>
           <w:numId w:val="3"/>
@@ -757,7 +757,7 @@
     </w:p>
     <w:p>
       <w:pPr>
-        <w:pStyle w:val="Paragraphedeliste"/>
+        <w:pStyle w:val="ListParagraph"/>
         <w:numPr>
           <w:ilvl w:val="2"/>
           <w:numId w:val="3"/>
@@ -806,7 +806,7 @@
     </w:p>
     <w:p>
       <w:pPr>
-        <w:pStyle w:val="Paragraphedeliste"/>
+        <w:pStyle w:val="ListParagraph"/>
         <w:numPr>
           <w:ilvl w:val="0"/>
           <w:numId w:val="5"/>
@@ -832,7 +832,7 @@
     </w:p>
     <w:p>
       <w:pPr>
-        <w:pStyle w:val="Paragraphedeliste"/>
+        <w:pStyle w:val="ListParagraph"/>
         <w:numPr>
           <w:ilvl w:val="1"/>
           <w:numId w:val="3"/>
@@ -867,7 +867,7 @@
     </w:p>
     <w:p>
       <w:pPr>
-        <w:pStyle w:val="Paragraphedeliste"/>
+        <w:pStyle w:val="ListParagraph"/>
         <w:numPr>
           <w:ilvl w:val="1"/>
           <w:numId w:val="3"/>
@@ -885,40 +885,32 @@
         <w:rPr>
           <w:lang w:val="en-US"/>
         </w:rPr>
-        <w:t>Example: &lt;img src</w:t>
-      </w:r>
-      <w:proofErr w:type="gramStart"/>
+        <w:t>Example: &lt;img src=”mars.jpg”&gt;</w:t>
+      </w:r>
       <w:r>
         <w:rPr>
           <w:lang w:val="en-US"/>
         </w:rPr>
-        <w:t>=”mars.jpg</w:t>
-      </w:r>
-      <w:proofErr w:type="gramEnd"/>
+        <w:t xml:space="preserve"> th</w:t>
+      </w:r>
       <w:r>
         <w:rPr>
           <w:lang w:val="en-US"/>
         </w:rPr>
-        <w:t>”&gt;</w:t>
+        <w:t>e file “mars.jpg” must be next to the index.html file</w:t>
       </w:r>
       <w:r>
         <w:rPr>
           <w:lang w:val="en-US"/>
         </w:rPr>
-        <w:t xml:space="preserve"> th</w:t>
-      </w:r>
-      <w:r>
-        <w:rPr>
-          <w:lang w:val="en-US"/>
-        </w:rPr>
-        <w:t>e file “mars.jpg” must be next to the index.html file, if not, you need to specify which folder the image is at, like “\images\space\mars.jpg”</w:t>
-      </w:r>
-    </w:p>
-    <w:p>
-      <w:pPr>
-        <w:pStyle w:val="Paragraphedeliste"/>
-        <w:numPr>
-          <w:ilvl w:val="1"/>
+        <w:t>.</w:t>
+      </w:r>
+    </w:p>
+    <w:p>
+      <w:pPr>
+        <w:pStyle w:val="ListParagraph"/>
+        <w:numPr>
+          <w:ilvl w:val="2"/>
           <w:numId w:val="3"/>
         </w:numPr>
         <w:rPr>
@@ -927,93 +919,112 @@
           <w:color w:val="538135" w:themeColor="accent6" w:themeShade="BF"/>
           <w:sz w:val="28"/>
           <w:szCs w:val="28"/>
-        </w:rPr>
-      </w:pPr>
-      <w:r>
-        <w:t>Note: This is</w:t>
-      </w:r>
-      <w:bookmarkStart w:id="0" w:name="_GoBack"/>
-      <w:bookmarkEnd w:id="0"/>
-      <w:r>
-        <w:t xml:space="preserve"> a “self-closing tag” there is no need to close it using </w:t>
-      </w:r>
-      <w:r>
-        <w:rPr>
-          <w:strike/>
-        </w:rPr>
-        <w:t>&lt;/img&gt;</w:t>
-      </w:r>
-    </w:p>
-    <w:p>
-      <w:pPr>
-        <w:pStyle w:val="Paragraphedeliste"/>
-        <w:numPr>
-          <w:ilvl w:val="1"/>
-          <w:numId w:val="3"/>
-        </w:numPr>
-      </w:pPr>
-      <w:r>
-        <w:t xml:space="preserve">By </w:t>
-      </w:r>
-      <w:r>
-        <w:t>default,</w:t>
-      </w:r>
-      <w:r>
-        <w:t xml:space="preserve"> the loaded image will not scale with the browser’s size or in other devices, to fix that we can use the “width” attribute</w:t>
-      </w:r>
-      <w:r>
-        <w:t xml:space="preserve"> to</w:t>
-      </w:r>
-      <w:r>
-        <w:t xml:space="preserve"> </w:t>
-      </w:r>
-      <w:r>
-        <w:t>specify</w:t>
-      </w:r>
-      <w:r>
-        <w:t xml:space="preserve"> a percentage of the screen that the image </w:t>
-      </w:r>
-      <w:r>
-        <w:t>can</w:t>
-      </w:r>
-      <w:r>
-        <w:t xml:space="preserve"> take, </w:t>
-      </w:r>
-      <w:r>
-        <w:t>ex:</w:t>
-      </w:r>
-      <w:r>
-        <w:t xml:space="preserve"> &lt;img src</w:t>
-      </w:r>
-      <w:proofErr w:type="gramStart"/>
-      <w:r>
-        <w:t>=”image.jpg</w:t>
-      </w:r>
-      <w:proofErr w:type="gramEnd"/>
-      <w:r>
-        <w:t>” width =”</w:t>
-      </w:r>
-      <w:r>
-        <w:t>5</w:t>
-      </w:r>
-      <w:r>
-        <w:t>0%</w:t>
-      </w:r>
-      <w:r>
-        <w:t>”</w:t>
-      </w:r>
-      <w:r>
+          <w:lang w:val="en-US"/>
+        </w:rPr>
+      </w:pPr>
+      <w:r>
+        <w:rPr>
+          <w:lang w:val="en-US"/>
+        </w:rPr>
+        <w:t xml:space="preserve">if </w:t>
+      </w:r>
+      <w:r>
+        <w:rPr>
+          <w:lang w:val="en-US"/>
+        </w:rPr>
+        <w:t xml:space="preserve">not, </w:t>
+      </w:r>
+      <w:r>
+        <w:rPr>
+          <w:lang w:val="en-US"/>
+        </w:rPr>
+        <w:t xml:space="preserve">you need to specify </w:t>
+      </w:r>
+      <w:r>
+        <w:rPr>
+          <w:lang w:val="en-US"/>
+        </w:rPr>
+        <w:t>the</w:t>
+      </w:r>
+      <w:r>
+        <w:rPr>
+          <w:lang w:val="en-US"/>
+        </w:rPr>
+        <w:t xml:space="preserve"> folder </w:t>
+      </w:r>
+      <w:r>
+        <w:rPr>
+          <w:lang w:val="en-US"/>
+        </w:rPr>
+        <w:t xml:space="preserve">which contains </w:t>
+      </w:r>
+      <w:r>
+        <w:rPr>
+          <w:lang w:val="en-US"/>
+        </w:rPr>
+        <w:t xml:space="preserve">the image </w:t>
+      </w:r>
+      <w:r>
+        <w:rPr>
+          <w:lang w:val="en-US"/>
+        </w:rPr>
+        <w:t xml:space="preserve">Example: </w:t>
+      </w:r>
+      <w:r>
+        <w:rPr>
+          <w:lang w:val="en-US"/>
+        </w:rPr>
+        <w:t>&lt;img src=”</w:t>
+      </w:r>
+      <w:r>
+        <w:rPr>
+          <w:lang w:val="en-US"/>
+        </w:rPr>
+        <w:t>./</w:t>
+      </w:r>
+      <w:r>
+        <w:rPr>
+          <w:lang w:val="en-US"/>
+        </w:rPr>
+        <w:t>images</w:t>
+      </w:r>
+      <w:r>
+        <w:rPr>
+          <w:lang w:val="en-US"/>
+        </w:rPr>
+        <w:t>/</w:t>
+      </w:r>
+      <w:r>
+        <w:rPr>
+          <w:lang w:val="en-US"/>
+        </w:rPr>
+        <w:t>space</w:t>
+      </w:r>
+      <w:r>
+        <w:rPr>
+          <w:lang w:val="en-US"/>
+        </w:rPr>
+        <w:t>/</w:t>
+      </w:r>
+      <w:r>
+        <w:rPr>
+          <w:lang w:val="en-US"/>
+        </w:rPr>
+        <w:t>mars.jpg”</w:t>
+      </w:r>
+      <w:r>
+        <w:rPr>
+          <w:lang w:val="en-US"/>
+        </w:rPr>
         <w:t>&gt;</w:t>
       </w:r>
     </w:p>
-    <w:p/>
-    <w:p/>
-    <w:p>
-      <w:pPr>
-        <w:pStyle w:val="Paragraphedeliste"/>
-        <w:numPr>
-          <w:ilvl w:val="0"/>
-          <w:numId w:val="5"/>
+    <w:p>
+      <w:pPr>
+        <w:pStyle w:val="ListParagraph"/>
+        <w:numPr>
+          <w:ilvl w:val="1"/>
+          <w:numId w:val="3"/>
         </w:numPr>
         <w:rPr>
           <w:b/>
@@ -1024,6 +1035,104 @@
         </w:rPr>
       </w:pPr>
       <w:r>
+        <w:t>Note: This is a “</w:t>
+      </w:r>
+      <w:r>
+        <w:rPr>
+          <w:b/>
+          <w:bCs/>
+        </w:rPr>
+        <w:t>self-closing tag</w:t>
+      </w:r>
+      <w:r>
+        <w:t>”</w:t>
+      </w:r>
+    </w:p>
+    <w:p>
+      <w:pPr>
+        <w:pStyle w:val="ListParagraph"/>
+        <w:numPr>
+          <w:ilvl w:val="1"/>
+          <w:numId w:val="3"/>
+        </w:numPr>
+      </w:pPr>
+      <w:r>
+        <w:t xml:space="preserve">By </w:t>
+      </w:r>
+      <w:r>
+        <w:t>default,</w:t>
+      </w:r>
+      <w:r>
+        <w:t xml:space="preserve"> the loaded image will not scale with the browser’s or other devices</w:t>
+      </w:r>
+      <w:r>
+        <w:t>’ sizes</w:t>
+      </w:r>
+      <w:r>
+        <w:t>, to fix that we can use the “</w:t>
+      </w:r>
+      <w:r>
+        <w:rPr>
+          <w:b/>
+          <w:bCs/>
+        </w:rPr>
+        <w:t>width</w:t>
+      </w:r>
+      <w:r>
+        <w:t>” attribute</w:t>
+      </w:r>
+      <w:r>
+        <w:t xml:space="preserve"> to</w:t>
+      </w:r>
+      <w:r>
+        <w:t xml:space="preserve"> </w:t>
+      </w:r>
+      <w:r>
+        <w:t>specify</w:t>
+      </w:r>
+      <w:r>
+        <w:t xml:space="preserve"> a percentage of the screen </w:t>
+      </w:r>
+      <w:r>
+        <w:t>which we allow the image to take</w:t>
+      </w:r>
+    </w:p>
+    <w:p>
+      <w:pPr>
+        <w:pStyle w:val="ListParagraph"/>
+        <w:numPr>
+          <w:ilvl w:val="2"/>
+          <w:numId w:val="3"/>
+        </w:numPr>
+      </w:pPr>
+      <w:r>
+        <w:t xml:space="preserve">Example </w:t>
+      </w:r>
+      <w:r>
+        <w:t>&lt;img src=”image.jpg” width =”</w:t>
+      </w:r>
+      <w:r>
+        <w:t>5</w:t>
+      </w:r>
+      <w:r>
+        <w:t>0%</w:t>
+      </w:r>
+      <w:r>
+        <w:t>”</w:t>
+      </w:r>
+      <w:r>
+        <w:t>&gt;</w:t>
+      </w:r>
+    </w:p>
+    <w:p/>
+    <w:p/>
+    <w:p>
+      <w:pPr>
+        <w:pStyle w:val="ListParagraph"/>
+        <w:numPr>
+          <w:ilvl w:val="0"/>
+          <w:numId w:val="5"/>
+        </w:numPr>
         <w:rPr>
           <w:b/>
           <w:bCs/>
@@ -1031,9 +1140,7 @@
           <w:sz w:val="28"/>
           <w:szCs w:val="28"/>
         </w:rPr>
-        <w:lastRenderedPageBreak/>
-        <w:t xml:space="preserve"> </w:t>
-      </w:r>
+      </w:pPr>
       <w:r>
         <w:rPr>
           <w:b/>
@@ -1042,12 +1149,22 @@
           <w:sz w:val="28"/>
           <w:szCs w:val="28"/>
         </w:rPr>
+        <w:t xml:space="preserve"> </w:t>
+      </w:r>
+      <w:r>
+        <w:rPr>
+          <w:b/>
+          <w:bCs/>
+          <w:color w:val="538135" w:themeColor="accent6" w:themeShade="BF"/>
+          <w:sz w:val="28"/>
+          <w:szCs w:val="28"/>
+        </w:rPr>
         <w:t>Nesting</w:t>
       </w:r>
     </w:p>
     <w:p>
       <w:pPr>
-        <w:pStyle w:val="Paragraphedeliste"/>
+        <w:pStyle w:val="ListParagraph"/>
         <w:numPr>
           <w:ilvl w:val="1"/>
           <w:numId w:val="3"/>
@@ -1071,7 +1188,7 @@
     </w:p>
     <w:p>
       <w:pPr>
-        <w:pStyle w:val="Paragraphedeliste"/>
+        <w:pStyle w:val="ListParagraph"/>
         <w:numPr>
           <w:ilvl w:val="1"/>
           <w:numId w:val="3"/>
@@ -1099,7 +1216,7 @@
     </w:p>
     <w:p>
       <w:pPr>
-        <w:pStyle w:val="Paragraphedeliste"/>
+        <w:pStyle w:val="ListParagraph"/>
         <w:numPr>
           <w:ilvl w:val="1"/>
           <w:numId w:val="3"/>
@@ -1109,43 +1226,232 @@
         <w:t>Nested elements have</w:t>
       </w:r>
       <w:r>
-        <w:t xml:space="preserve"> parent/child </w:t>
-      </w:r>
-      <w:r>
-        <w:t>relation, the outer element is the parent and the inner element is the child.</w:t>
-      </w:r>
-    </w:p>
-    <w:p>
-      <w:pPr>
-        <w:pStyle w:val="Paragraphedeliste"/>
-        <w:numPr>
-          <w:ilvl w:val="1"/>
-          <w:numId w:val="3"/>
-        </w:numPr>
-      </w:pPr>
-      <w:r>
-        <w:t>These are used to group elements together, improving future code scalability and allowing them to be styled collectively with CSS or manipulated as a group using JavaScript.</w:t>
-      </w:r>
-      <w:r>
         <w:t xml:space="preserve"> </w:t>
       </w:r>
-    </w:p>
-    <w:p>
-      <w:pPr>
-        <w:pStyle w:val="Paragraphedeliste"/>
-        <w:numPr>
-          <w:ilvl w:val="1"/>
-          <w:numId w:val="3"/>
-        </w:numPr>
-      </w:pPr>
-      <w:r>
-        <w:t>Example: The &lt;div&gt;&lt;/div&gt; tag</w:t>
+      <w:r>
+        <w:rPr>
+          <w:b/>
+          <w:bCs/>
+        </w:rPr>
+        <w:t xml:space="preserve">parent/child </w:t>
+      </w:r>
+      <w:r>
+        <w:rPr>
+          <w:b/>
+          <w:bCs/>
+        </w:rPr>
+        <w:t>relation</w:t>
+      </w:r>
+      <w:r>
+        <w:t xml:space="preserve">, the </w:t>
+      </w:r>
+      <w:r>
+        <w:rPr>
+          <w:b/>
+          <w:bCs/>
+        </w:rPr>
+        <w:t>outer</w:t>
+      </w:r>
+      <w:r>
+        <w:t xml:space="preserve"> element is the </w:t>
+      </w:r>
+      <w:r>
+        <w:rPr>
+          <w:b/>
+          <w:bCs/>
+        </w:rPr>
+        <w:t>parent</w:t>
+      </w:r>
+      <w:r>
+        <w:t xml:space="preserve"> and the </w:t>
+      </w:r>
+      <w:r>
+        <w:rPr>
+          <w:b/>
+          <w:bCs/>
+        </w:rPr>
+        <w:t>inner</w:t>
+      </w:r>
+      <w:r>
+        <w:t xml:space="preserve"> element is the </w:t>
+      </w:r>
+      <w:r>
+        <w:rPr>
+          <w:b/>
+          <w:bCs/>
+        </w:rPr>
+        <w:t>child</w:t>
+      </w:r>
+      <w:r>
+        <w:t>.</w:t>
+      </w:r>
+    </w:p>
+    <w:p>
+      <w:pPr>
+        <w:pStyle w:val="ListParagraph"/>
+        <w:numPr>
+          <w:ilvl w:val="1"/>
+          <w:numId w:val="3"/>
+        </w:numPr>
+      </w:pPr>
+      <w:r>
+        <w:t>Nesting is</w:t>
+      </w:r>
+      <w:r>
+        <w:t xml:space="preserve"> used to </w:t>
+      </w:r>
+      <w:r>
+        <w:rPr>
+          <w:b/>
+          <w:bCs/>
+        </w:rPr>
+        <w:t>group</w:t>
+      </w:r>
+      <w:r>
+        <w:t xml:space="preserve"> elements </w:t>
+      </w:r>
+      <w:r>
+        <w:rPr>
+          <w:b/>
+          <w:bCs/>
+        </w:rPr>
+        <w:t>together</w:t>
+      </w:r>
+      <w:r>
+        <w:t xml:space="preserve">, improving </w:t>
+      </w:r>
+      <w:r>
+        <w:rPr>
+          <w:b/>
+          <w:bCs/>
+        </w:rPr>
+        <w:t>future</w:t>
+      </w:r>
+      <w:r>
+        <w:t xml:space="preserve"> code </w:t>
+      </w:r>
+      <w:r>
+        <w:rPr>
+          <w:b/>
+          <w:bCs/>
+        </w:rPr>
+        <w:t>scalability</w:t>
+      </w:r>
+      <w:r>
+        <w:t xml:space="preserve"> and allowing them to be </w:t>
+      </w:r>
+      <w:r>
+        <w:rPr>
+          <w:b/>
+          <w:bCs/>
+        </w:rPr>
+        <w:t>styled</w:t>
+      </w:r>
+      <w:r>
+        <w:t xml:space="preserve"> </w:t>
+      </w:r>
+      <w:r>
+        <w:rPr>
+          <w:b/>
+          <w:bCs/>
+        </w:rPr>
+        <w:t>collectively</w:t>
+      </w:r>
+      <w:r>
+        <w:t xml:space="preserve"> </w:t>
+      </w:r>
+      <w:r>
+        <w:t>using</w:t>
+      </w:r>
+      <w:r>
+        <w:t xml:space="preserve"> </w:t>
+      </w:r>
+      <w:r>
+        <w:rPr>
+          <w:b/>
+          <w:bCs/>
+        </w:rPr>
+        <w:t>CSS</w:t>
+      </w:r>
+      <w:r>
+        <w:t xml:space="preserve"> or </w:t>
+      </w:r>
+      <w:r>
+        <w:rPr>
+          <w:b/>
+          <w:bCs/>
+        </w:rPr>
+        <w:t>manipulated</w:t>
+      </w:r>
+      <w:r>
+        <w:t xml:space="preserve"> </w:t>
+      </w:r>
+      <w:r>
+        <w:rPr>
+          <w:b/>
+          <w:bCs/>
+        </w:rPr>
+        <w:t>as a group</w:t>
+      </w:r>
+      <w:r>
+        <w:t xml:space="preserve"> using </w:t>
+      </w:r>
+      <w:r>
+        <w:rPr>
+          <w:b/>
+          <w:bCs/>
+        </w:rPr>
+        <w:t>JavaScript</w:t>
+      </w:r>
+      <w:r>
+        <w:t>.</w:t>
+      </w:r>
+      <w:r>
+        <w:t xml:space="preserve"> </w:t>
+      </w:r>
+    </w:p>
+    <w:p>
+      <w:pPr>
+        <w:pStyle w:val="ListParagraph"/>
+        <w:numPr>
+          <w:ilvl w:val="1"/>
+          <w:numId w:val="3"/>
+        </w:numPr>
+      </w:pPr>
+      <w:r>
+        <w:t>Example: The &lt;</w:t>
+      </w:r>
+      <w:r>
+        <w:rPr>
+          <w:b/>
+          <w:bCs/>
+        </w:rPr>
+        <w:t>div</w:t>
+      </w:r>
+      <w:r>
+        <w:t>&gt;&lt;/</w:t>
+      </w:r>
+      <w:r>
+        <w:rPr>
+          <w:b/>
+          <w:bCs/>
+        </w:rPr>
+        <w:t>div</w:t>
+      </w:r>
+      <w:r>
+        <w:t>&gt; tag</w:t>
       </w:r>
       <w:r>
         <w:t>, it has no effect on the content of the webpage, but it</w:t>
       </w:r>
       <w:r>
-        <w:t xml:space="preserve"> is used as a container to gather HTML elements that belong together in a single group</w:t>
+        <w:t xml:space="preserve"> is used as a container to </w:t>
+      </w:r>
+      <w:r>
+        <w:t>put</w:t>
+      </w:r>
+      <w:r>
+        <w:t xml:space="preserve"> HTML elements that belong together in a single group</w:t>
       </w:r>
       <w:r>
         <w:t>, as shown below.</w:t>
@@ -1198,7 +1504,7 @@
     </w:p>
     <w:p>
       <w:pPr>
-        <w:pStyle w:val="Paragraphedeliste"/>
+        <w:pStyle w:val="ListParagraph"/>
         <w:numPr>
           <w:ilvl w:val="1"/>
           <w:numId w:val="3"/>
@@ -1265,7 +1571,7 @@
     </w:p>
     <w:p>
       <w:pPr>
-        <w:pStyle w:val="Paragraphedeliste"/>
+        <w:pStyle w:val="ListParagraph"/>
         <w:numPr>
           <w:ilvl w:val="1"/>
           <w:numId w:val="3"/>
@@ -1277,7 +1583,7 @@
     </w:p>
     <w:p>
       <w:pPr>
-        <w:pStyle w:val="Paragraphedeliste"/>
+        <w:pStyle w:val="ListParagraph"/>
         <w:numPr>
           <w:ilvl w:val="0"/>
           <w:numId w:val="5"/>
@@ -1313,7 +1619,7 @@
     </w:p>
     <w:p>
       <w:pPr>
-        <w:pStyle w:val="Paragraphedeliste"/>
+        <w:pStyle w:val="ListParagraph"/>
         <w:numPr>
           <w:ilvl w:val="1"/>
           <w:numId w:val="3"/>
@@ -1341,7 +1647,7 @@
     </w:p>
     <w:p>
       <w:pPr>
-        <w:pStyle w:val="Paragraphedeliste"/>
+        <w:pStyle w:val="ListParagraph"/>
         <w:numPr>
           <w:ilvl w:val="1"/>
           <w:numId w:val="3"/>
@@ -1379,7 +1685,7 @@
     <w:p/>
     <w:p>
       <w:pPr>
-        <w:pStyle w:val="Paragraphedeliste"/>
+        <w:pStyle w:val="ListParagraph"/>
         <w:numPr>
           <w:ilvl w:val="0"/>
           <w:numId w:val="5"/>
@@ -1400,7 +1706,6 @@
           <w:sz w:val="28"/>
           <w:szCs w:val="28"/>
         </w:rPr>
-        <w:lastRenderedPageBreak/>
         <w:t xml:space="preserve"> </w:t>
       </w:r>
       <w:r>
@@ -1446,7 +1751,7 @@
     </w:p>
     <w:p>
       <w:pPr>
-        <w:pStyle w:val="Paragraphedeliste"/>
+        <w:pStyle w:val="ListParagraph"/>
         <w:numPr>
           <w:ilvl w:val="1"/>
           <w:numId w:val="3"/>
@@ -1468,7 +1773,7 @@
     </w:p>
     <w:p>
       <w:pPr>
-        <w:pStyle w:val="Paragraphedeliste"/>
+        <w:pStyle w:val="ListParagraph"/>
         <w:numPr>
           <w:ilvl w:val="1"/>
           <w:numId w:val="3"/>
@@ -1511,7 +1816,7 @@
     </w:p>
     <w:p>
       <w:pPr>
-        <w:pStyle w:val="Paragraphedeliste"/>
+        <w:pStyle w:val="ListParagraph"/>
         <w:numPr>
           <w:ilvl w:val="1"/>
           <w:numId w:val="3"/>
@@ -1546,54 +1851,68 @@
           <w:ilvl w:val="1"/>
           <w:numId w:val="7"/>
         </w:numPr>
-      </w:pPr>
-      <w:r>
-        <w:rPr>
-          <w:rStyle w:val="CodeHTML"/>
-          <w:rFonts w:eastAsiaTheme="majorEastAsia"/>
-        </w:rPr>
-        <w:t>text</w:t>
-      </w:r>
-      <w:r>
+        <w:rPr>
+          <w:rFonts w:asciiTheme="minorHAnsi" w:eastAsiaTheme="minorHAnsi" w:hAnsiTheme="minorHAnsi" w:cstheme="minorBidi"/>
+          <w:kern w:val="2"/>
+          <w:lang w:eastAsia="en-US"/>
+          <w14:ligatures w14:val="standardContextual"/>
+        </w:rPr>
+      </w:pPr>
+      <w:r>
+        <w:rPr>
+          <w:rFonts w:asciiTheme="minorHAnsi" w:eastAsiaTheme="minorHAnsi" w:hAnsiTheme="minorHAnsi" w:cstheme="minorBidi"/>
+          <w:kern w:val="2"/>
+          <w:lang w:eastAsia="en-US"/>
+          <w14:ligatures w14:val="standardContextual"/>
+        </w:rPr>
+        <w:t>text, password, email, number, search</w:t>
+      </w:r>
+    </w:p>
+    <w:p>
+      <w:pPr>
+        <w:pStyle w:val="NormalWeb"/>
+        <w:numPr>
+          <w:ilvl w:val="1"/>
+          <w:numId w:val="7"/>
+        </w:numPr>
+        <w:rPr>
+          <w:rFonts w:asciiTheme="minorHAnsi" w:eastAsiaTheme="minorHAnsi" w:hAnsiTheme="minorHAnsi" w:cstheme="minorBidi"/>
+          <w:kern w:val="2"/>
+          <w:lang w:eastAsia="en-US"/>
+          <w14:ligatures w14:val="standardContextual"/>
+        </w:rPr>
+      </w:pPr>
+      <w:proofErr w:type="spellStart"/>
+      <w:r>
+        <w:rPr>
+          <w:rFonts w:asciiTheme="minorHAnsi" w:eastAsiaTheme="minorHAnsi" w:hAnsiTheme="minorHAnsi" w:cstheme="minorBidi"/>
+          <w:kern w:val="2"/>
+          <w:lang w:eastAsia="en-US"/>
+          <w14:ligatures w14:val="standardContextual"/>
+        </w:rPr>
+        <w:t>tel</w:t>
+      </w:r>
+      <w:proofErr w:type="spellEnd"/>
+      <w:r>
+        <w:rPr>
+          <w:rFonts w:asciiTheme="minorHAnsi" w:eastAsiaTheme="minorHAnsi" w:hAnsiTheme="minorHAnsi" w:cstheme="minorBidi"/>
+          <w:kern w:val="2"/>
+          <w:lang w:eastAsia="en-US"/>
+          <w14:ligatures w14:val="standardContextual"/>
+        </w:rPr>
         <w:t xml:space="preserve">, </w:t>
       </w:r>
-      <w:r>
-        <w:rPr>
-          <w:rStyle w:val="CodeHTML"/>
-          <w:rFonts w:eastAsiaTheme="majorEastAsia"/>
-        </w:rPr>
-        <w:t>password</w:t>
-      </w:r>
-      <w:r>
-        <w:t xml:space="preserve">, </w:t>
-      </w:r>
-      <w:r>
-        <w:rPr>
-          <w:rStyle w:val="CodeHTML"/>
-          <w:rFonts w:eastAsiaTheme="majorEastAsia"/>
-        </w:rPr>
-        <w:t>email</w:t>
-      </w:r>
-      <w:r>
-        <w:t xml:space="preserve">, </w:t>
-      </w:r>
-      <w:r>
-        <w:rPr>
-          <w:rStyle w:val="CodeHTML"/>
-          <w:rFonts w:eastAsiaTheme="majorEastAsia"/>
-        </w:rPr>
-        <w:t>number</w:t>
-      </w:r>
-      <w:r>
-        <w:t xml:space="preserve">, </w:t>
-      </w:r>
-      <w:r>
-        <w:rPr>
-          <w:rStyle w:val="CodeHTML"/>
-          <w:rFonts w:eastAsiaTheme="majorEastAsia"/>
-        </w:rPr>
-        <w:t>search</w:t>
-      </w:r>
+      <w:proofErr w:type="spellStart"/>
+      <w:r>
+        <w:rPr>
+          <w:rFonts w:asciiTheme="minorHAnsi" w:eastAsiaTheme="minorHAnsi" w:hAnsiTheme="minorHAnsi" w:cstheme="minorBidi"/>
+          <w:kern w:val="2"/>
+          <w:lang w:eastAsia="en-US"/>
+          <w14:ligatures w14:val="standardContextual"/>
+        </w:rPr>
+        <w:t>url</w:t>
+      </w:r>
+      <w:proofErr w:type="spellEnd"/>
     </w:p>
     <w:p>
       <w:pPr>
@@ -1602,28 +1921,22 @@
           <w:ilvl w:val="1"/>
           <w:numId w:val="7"/>
         </w:numPr>
-      </w:pPr>
-      <w:proofErr w:type="spellStart"/>
-      <w:r>
-        <w:rPr>
-          <w:rStyle w:val="CodeHTML"/>
-          <w:rFonts w:eastAsiaTheme="majorEastAsia"/>
-        </w:rPr>
-        <w:t>tel</w:t>
-      </w:r>
-      <w:proofErr w:type="spellEnd"/>
-      <w:r>
-        <w:t xml:space="preserve">, </w:t>
-      </w:r>
-      <w:proofErr w:type="spellStart"/>
-      <w:r>
-        <w:rPr>
-          <w:rStyle w:val="CodeHTML"/>
-          <w:rFonts w:eastAsiaTheme="majorEastAsia"/>
-        </w:rPr>
-        <w:t>url</w:t>
-      </w:r>
-      <w:proofErr w:type="spellEnd"/>
+        <w:rPr>
+          <w:rFonts w:asciiTheme="minorHAnsi" w:eastAsiaTheme="minorHAnsi" w:hAnsiTheme="minorHAnsi" w:cstheme="minorBidi"/>
+          <w:kern w:val="2"/>
+          <w:lang w:eastAsia="en-US"/>
+          <w14:ligatures w14:val="standardContextual"/>
+        </w:rPr>
+      </w:pPr>
+      <w:r>
+        <w:rPr>
+          <w:rFonts w:asciiTheme="minorHAnsi" w:eastAsiaTheme="minorHAnsi" w:hAnsiTheme="minorHAnsi" w:cstheme="minorBidi"/>
+          <w:kern w:val="2"/>
+          <w:lang w:eastAsia="en-US"/>
+          <w14:ligatures w14:val="standardContextual"/>
+        </w:rPr>
+        <w:t>date, time</w:t>
+      </w:r>
     </w:p>
     <w:p>
       <w:pPr>
@@ -1632,23 +1945,21 @@
           <w:ilvl w:val="1"/>
           <w:numId w:val="7"/>
         </w:numPr>
-      </w:pPr>
-      <w:r>
-        <w:rPr>
-          <w:rStyle w:val="CodeHTML"/>
-          <w:rFonts w:eastAsiaTheme="majorEastAsia"/>
-        </w:rPr>
-        <w:t>date</w:t>
-      </w:r>
-      <w:r>
-        <w:t xml:space="preserve">, </w:t>
-      </w:r>
-      <w:r>
-        <w:rPr>
-          <w:rStyle w:val="CodeHTML"/>
-          <w:rFonts w:eastAsiaTheme="majorEastAsia"/>
-        </w:rPr>
-        <w:t>time</w:t>
+        <w:rPr>
+          <w:rFonts w:asciiTheme="minorHAnsi" w:eastAsiaTheme="minorHAnsi" w:hAnsiTheme="minorHAnsi" w:cstheme="minorBidi"/>
+          <w:kern w:val="2"/>
+          <w:lang w:eastAsia="en-US"/>
+          <w14:ligatures w14:val="standardContextual"/>
+        </w:rPr>
+      </w:pPr>
+      <w:r>
+        <w:rPr>
+          <w:rFonts w:asciiTheme="minorHAnsi" w:eastAsiaTheme="minorHAnsi" w:hAnsiTheme="minorHAnsi" w:cstheme="minorBidi"/>
+          <w:kern w:val="2"/>
+          <w:lang w:eastAsia="en-US"/>
+          <w14:ligatures w14:val="standardContextual"/>
+        </w:rPr>
+        <w:t>checkbox, radio</w:t>
       </w:r>
     </w:p>
     <w:p>
@@ -1658,23 +1969,21 @@
           <w:ilvl w:val="1"/>
           <w:numId w:val="7"/>
         </w:numPr>
-      </w:pPr>
-      <w:r>
-        <w:rPr>
-          <w:rStyle w:val="CodeHTML"/>
-          <w:rFonts w:eastAsiaTheme="majorEastAsia"/>
-        </w:rPr>
-        <w:t>checkbox</w:t>
-      </w:r>
-      <w:r>
-        <w:t xml:space="preserve">, </w:t>
-      </w:r>
-      <w:r>
-        <w:rPr>
-          <w:rStyle w:val="CodeHTML"/>
-          <w:rFonts w:eastAsiaTheme="majorEastAsia"/>
-        </w:rPr>
-        <w:t>radio</w:t>
+        <w:rPr>
+          <w:rFonts w:asciiTheme="minorHAnsi" w:eastAsiaTheme="minorHAnsi" w:hAnsiTheme="minorHAnsi" w:cstheme="minorBidi"/>
+          <w:kern w:val="2"/>
+          <w:lang w:eastAsia="en-US"/>
+          <w14:ligatures w14:val="standardContextual"/>
+        </w:rPr>
+      </w:pPr>
+      <w:r>
+        <w:rPr>
+          <w:rFonts w:asciiTheme="minorHAnsi" w:eastAsiaTheme="minorHAnsi" w:hAnsiTheme="minorHAnsi" w:cstheme="minorBidi"/>
+          <w:kern w:val="2"/>
+          <w:lang w:eastAsia="en-US"/>
+          <w14:ligatures w14:val="standardContextual"/>
+        </w:rPr>
+        <w:t>file, hidden</w:t>
       </w:r>
     </w:p>
     <w:p>
@@ -1684,74 +1993,26 @@
           <w:ilvl w:val="1"/>
           <w:numId w:val="7"/>
         </w:numPr>
-      </w:pPr>
-      <w:r>
-        <w:rPr>
-          <w:rStyle w:val="CodeHTML"/>
-          <w:rFonts w:eastAsiaTheme="majorEastAsia"/>
-        </w:rPr>
-        <w:t>file</w:t>
-      </w:r>
-      <w:r>
-        <w:t xml:space="preserve">, </w:t>
-      </w:r>
-      <w:r>
-        <w:rPr>
-          <w:rStyle w:val="CodeHTML"/>
-          <w:rFonts w:eastAsiaTheme="majorEastAsia"/>
-        </w:rPr>
-        <w:t>hidden</w:t>
-      </w:r>
-    </w:p>
-    <w:p>
-      <w:pPr>
-        <w:pStyle w:val="NormalWeb"/>
-        <w:numPr>
-          <w:ilvl w:val="1"/>
-          <w:numId w:val="7"/>
-        </w:numPr>
-      </w:pPr>
-      <w:r>
-        <w:rPr>
-          <w:rStyle w:val="CodeHTML"/>
-          <w:rFonts w:eastAsiaTheme="majorEastAsia"/>
-        </w:rPr>
-        <w:t>submit</w:t>
-      </w:r>
-      <w:r>
-        <w:t xml:space="preserve">, </w:t>
-      </w:r>
-      <w:r>
-        <w:rPr>
-          <w:rStyle w:val="CodeHTML"/>
-          <w:rFonts w:eastAsiaTheme="majorEastAsia"/>
-        </w:rPr>
-        <w:t>reset</w:t>
-      </w:r>
-      <w:r>
-        <w:t xml:space="preserve">, </w:t>
-      </w:r>
-      <w:r>
-        <w:rPr>
-          <w:rStyle w:val="CodeHTML"/>
-          <w:rFonts w:eastAsiaTheme="majorEastAsia"/>
-        </w:rPr>
-        <w:t>button</w:t>
-      </w:r>
-      <w:r>
-        <w:t xml:space="preserve">, </w:t>
-      </w:r>
-      <w:r>
-        <w:rPr>
-          <w:rStyle w:val="CodeHTML"/>
-          <w:rFonts w:eastAsiaTheme="majorEastAsia"/>
-        </w:rPr>
-        <w:t>image</w:t>
-      </w:r>
-    </w:p>
-    <w:p>
-      <w:pPr>
-        <w:pStyle w:val="Paragraphedeliste"/>
+        <w:rPr>
+          <w:rFonts w:asciiTheme="minorHAnsi" w:eastAsiaTheme="minorHAnsi" w:hAnsiTheme="minorHAnsi" w:cstheme="minorBidi"/>
+          <w:kern w:val="2"/>
+          <w:lang w:eastAsia="en-US"/>
+          <w14:ligatures w14:val="standardContextual"/>
+        </w:rPr>
+      </w:pPr>
+      <w:r>
+        <w:rPr>
+          <w:rFonts w:asciiTheme="minorHAnsi" w:eastAsiaTheme="minorHAnsi" w:hAnsiTheme="minorHAnsi" w:cstheme="minorBidi"/>
+          <w:kern w:val="2"/>
+          <w:lang w:eastAsia="en-US"/>
+          <w14:ligatures w14:val="standardContextual"/>
+        </w:rPr>
+        <w:t>submit, reset, button, image</w:t>
+      </w:r>
+    </w:p>
+    <w:p>
+      <w:pPr>
+        <w:pStyle w:val="ListParagraph"/>
         <w:numPr>
           <w:ilvl w:val="1"/>
           <w:numId w:val="3"/>
@@ -1763,7 +2024,7 @@
     </w:p>
     <w:p>
       <w:pPr>
-        <w:pStyle w:val="Paragraphedeliste"/>
+        <w:pStyle w:val="ListParagraph"/>
         <w:numPr>
           <w:ilvl w:val="1"/>
           <w:numId w:val="3"/>
@@ -1799,7 +2060,7 @@
     </w:p>
     <w:p>
       <w:pPr>
-        <w:pStyle w:val="Paragraphedeliste"/>
+        <w:pStyle w:val="ListParagraph"/>
         <w:numPr>
           <w:ilvl w:val="0"/>
           <w:numId w:val="5"/>
@@ -1835,7 +2096,7 @@
     </w:p>
     <w:p>
       <w:pPr>
-        <w:pStyle w:val="Paragraphedeliste"/>
+        <w:pStyle w:val="ListParagraph"/>
         <w:numPr>
           <w:ilvl w:val="1"/>
           <w:numId w:val="3"/>
@@ -1853,7 +2114,7 @@
     </w:p>
     <w:p>
       <w:pPr>
-        <w:pStyle w:val="Paragraphedeliste"/>
+        <w:pStyle w:val="ListParagraph"/>
         <w:numPr>
           <w:ilvl w:val="0"/>
           <w:numId w:val="5"/>
@@ -1889,7 +2150,7 @@
     </w:p>
     <w:p>
       <w:pPr>
-        <w:pStyle w:val="Paragraphedeliste"/>
+        <w:pStyle w:val="ListParagraph"/>
         <w:numPr>
           <w:ilvl w:val="1"/>
           <w:numId w:val="3"/>
@@ -1911,7 +2172,7 @@
     </w:p>
     <w:p>
       <w:pPr>
-        <w:pStyle w:val="Paragraphedeliste"/>
+        <w:pStyle w:val="ListParagraph"/>
         <w:numPr>
           <w:ilvl w:val="1"/>
           <w:numId w:val="3"/>
@@ -1923,7 +2184,7 @@
     </w:p>
     <w:p>
       <w:pPr>
-        <w:pStyle w:val="Paragraphedeliste"/>
+        <w:pStyle w:val="ListParagraph"/>
         <w:numPr>
           <w:ilvl w:val="1"/>
           <w:numId w:val="3"/>
@@ -1941,7 +2202,7 @@
       <w:hyperlink r:id="rId7" w:history="1">
         <w:r>
           <w:rPr>
-            <w:rStyle w:val="Lienhypertexte"/>
+            <w:rStyle w:val="Hyperlink"/>
           </w:rPr>
           <w:t>here</w:t>
         </w:r>
@@ -1962,7 +2223,7 @@
     </w:p>
     <w:p>
       <w:pPr>
-        <w:pStyle w:val="Paragraphedeliste"/>
+        <w:pStyle w:val="ListParagraph"/>
         <w:numPr>
           <w:ilvl w:val="1"/>
           <w:numId w:val="3"/>
@@ -1994,7 +2255,7 @@
     </w:p>
     <w:p>
       <w:pPr>
-        <w:pStyle w:val="Paragraphedeliste"/>
+        <w:pStyle w:val="ListParagraph"/>
         <w:numPr>
           <w:ilvl w:val="1"/>
           <w:numId w:val="3"/>
@@ -2022,7 +2283,7 @@
     </w:p>
     <w:p>
       <w:pPr>
-        <w:pStyle w:val="Paragraphedeliste"/>
+        <w:pStyle w:val="ListParagraph"/>
         <w:numPr>
           <w:ilvl w:val="0"/>
           <w:numId w:val="5"/>
@@ -2058,7 +2319,7 @@
     </w:p>
     <w:p>
       <w:pPr>
-        <w:pStyle w:val="Paragraphedeliste"/>
+        <w:pStyle w:val="ListParagraph"/>
         <w:numPr>
           <w:ilvl w:val="1"/>
           <w:numId w:val="3"/>
@@ -2070,14 +2331,24 @@
     </w:p>
     <w:p>
       <w:pPr>
-        <w:pStyle w:val="Paragraphedeliste"/>
-        <w:numPr>
-          <w:ilvl w:val="1"/>
-          <w:numId w:val="3"/>
-        </w:numPr>
-      </w:pPr>
-      <w:r>
-        <w:t xml:space="preserve">&lt;!DOCTYPE html&gt; </w:t>
+        <w:pStyle w:val="ListParagraph"/>
+        <w:numPr>
+          <w:ilvl w:val="1"/>
+          <w:numId w:val="3"/>
+        </w:numPr>
+      </w:pPr>
+      <w:r>
+        <w:t>&lt;!</w:t>
+      </w:r>
+      <w:r>
+        <w:rPr>
+          <w:b/>
+          <w:bCs/>
+        </w:rPr>
+        <w:t>DOCTYPE</w:t>
+      </w:r>
+      <w:r>
+        <w:t xml:space="preserve"> html&gt; </w:t>
       </w:r>
       <w:r>
         <w:sym w:font="Wingdings" w:char="F0E8"/>
@@ -2088,14 +2359,34 @@
     </w:p>
     <w:p>
       <w:pPr>
-        <w:pStyle w:val="Paragraphedeliste"/>
-        <w:numPr>
-          <w:ilvl w:val="1"/>
-          <w:numId w:val="3"/>
-        </w:numPr>
-      </w:pPr>
-      <w:r>
-        <w:t xml:space="preserve">&lt;html&gt;&lt;/html&gt; </w:t>
+        <w:pStyle w:val="ListParagraph"/>
+        <w:numPr>
+          <w:ilvl w:val="1"/>
+          <w:numId w:val="3"/>
+        </w:numPr>
+      </w:pPr>
+      <w:r>
+        <w:t>&lt;</w:t>
+      </w:r>
+      <w:r>
+        <w:rPr>
+          <w:b/>
+          <w:bCs/>
+        </w:rPr>
+        <w:t>html</w:t>
+      </w:r>
+      <w:r>
+        <w:t>&gt;&lt;/</w:t>
+      </w:r>
+      <w:r>
+        <w:rPr>
+          <w:b/>
+          <w:bCs/>
+        </w:rPr>
+        <w:t>html</w:t>
+      </w:r>
+      <w:r>
+        <w:t xml:space="preserve">&gt; </w:t>
       </w:r>
       <w:r>
         <w:sym w:font="Wingdings" w:char="F0E8"/>
@@ -2106,20 +2397,71 @@
     </w:p>
     <w:p>
       <w:pPr>
-        <w:pStyle w:val="Paragraphedeliste"/>
-        <w:numPr>
-          <w:ilvl w:val="1"/>
-          <w:numId w:val="3"/>
-        </w:numPr>
-      </w:pPr>
-      <w:r>
-        <w:t xml:space="preserve">&lt;head&gt;&lt;/head&gt; </w:t>
+        <w:pStyle w:val="ListParagraph"/>
+        <w:numPr>
+          <w:ilvl w:val="1"/>
+          <w:numId w:val="3"/>
+        </w:numPr>
+      </w:pPr>
+      <w:r>
+        <w:lastRenderedPageBreak/>
+        <w:t>&lt;</w:t>
+      </w:r>
+      <w:r>
+        <w:rPr>
+          <w:b/>
+          <w:bCs/>
+        </w:rPr>
+        <w:t>head</w:t>
+      </w:r>
+      <w:r>
+        <w:t>&gt;&lt;/</w:t>
+      </w:r>
+      <w:r>
+        <w:rPr>
+          <w:b/>
+          <w:bCs/>
+        </w:rPr>
+        <w:t>head</w:t>
+      </w:r>
+      <w:r>
+        <w:t xml:space="preserve">&gt; </w:t>
       </w:r>
       <w:r>
         <w:sym w:font="Wingdings" w:char="F0E8"/>
       </w:r>
       <w:r>
-        <w:t xml:space="preserve"> This tag includes the webpage’s meta data, like the &lt;meta&gt; tag, the &lt;title&gt; tag, the &lt;link&gt; tag (referencing the </w:t>
+        <w:t xml:space="preserve"> This tag includes the webpage’s meta data, like the &lt;</w:t>
+      </w:r>
+      <w:r>
+        <w:rPr>
+          <w:b/>
+          <w:bCs/>
+        </w:rPr>
+        <w:t>meta</w:t>
+      </w:r>
+      <w:r>
+        <w:t>&gt; tag, the &lt;</w:t>
+      </w:r>
+      <w:r>
+        <w:rPr>
+          <w:b/>
+          <w:bCs/>
+        </w:rPr>
+        <w:t>title</w:t>
+      </w:r>
+      <w:r>
+        <w:t>&gt; tag, the &lt;</w:t>
+      </w:r>
+      <w:r>
+        <w:rPr>
+          <w:b/>
+          <w:bCs/>
+        </w:rPr>
+        <w:t>link</w:t>
+      </w:r>
+      <w:r>
+        <w:t xml:space="preserve">&gt; tag (referencing the </w:t>
       </w:r>
       <w:r>
         <w:t>CSS</w:t>
@@ -2130,14 +2472,34 @@
     </w:p>
     <w:p>
       <w:pPr>
-        <w:pStyle w:val="Paragraphedeliste"/>
-        <w:numPr>
-          <w:ilvl w:val="1"/>
-          <w:numId w:val="3"/>
-        </w:numPr>
-      </w:pPr>
-      <w:r>
-        <w:t>&lt;title&gt;&lt;/title&gt;</w:t>
+        <w:pStyle w:val="ListParagraph"/>
+        <w:numPr>
+          <w:ilvl w:val="1"/>
+          <w:numId w:val="3"/>
+        </w:numPr>
+      </w:pPr>
+      <w:r>
+        <w:t>&lt;</w:t>
+      </w:r>
+      <w:r>
+        <w:rPr>
+          <w:b/>
+          <w:bCs/>
+        </w:rPr>
+        <w:t>title</w:t>
+      </w:r>
+      <w:r>
+        <w:t>&gt;&lt;/</w:t>
+      </w:r>
+      <w:r>
+        <w:rPr>
+          <w:b/>
+          <w:bCs/>
+        </w:rPr>
+        <w:t>title</w:t>
+      </w:r>
+      <w:r>
+        <w:t>&gt;</w:t>
       </w:r>
       <w:r>
         <w:t xml:space="preserve"> </w:t>
@@ -2151,14 +2513,34 @@
     </w:p>
     <w:p>
       <w:pPr>
-        <w:pStyle w:val="Paragraphedeliste"/>
-        <w:numPr>
-          <w:ilvl w:val="1"/>
-          <w:numId w:val="3"/>
-        </w:numPr>
-      </w:pPr>
-      <w:r>
-        <w:t xml:space="preserve">&lt;body&gt;&lt;/body&gt; </w:t>
+        <w:pStyle w:val="ListParagraph"/>
+        <w:numPr>
+          <w:ilvl w:val="1"/>
+          <w:numId w:val="3"/>
+        </w:numPr>
+      </w:pPr>
+      <w:r>
+        <w:t>&lt;</w:t>
+      </w:r>
+      <w:r>
+        <w:rPr>
+          <w:b/>
+          <w:bCs/>
+        </w:rPr>
+        <w:t>body</w:t>
+      </w:r>
+      <w:r>
+        <w:t>&gt;&lt;/</w:t>
+      </w:r>
+      <w:r>
+        <w:rPr>
+          <w:b/>
+          <w:bCs/>
+        </w:rPr>
+        <w:t>body</w:t>
+      </w:r>
+      <w:r>
+        <w:t xml:space="preserve">&gt; </w:t>
       </w:r>
       <w:r>
         <w:sym w:font="Wingdings" w:char="F0E8"/>
@@ -2179,7 +2561,7 @@
     </w:p>
     <w:p>
       <w:pPr>
-        <w:pStyle w:val="Paragraphedeliste"/>
+        <w:pStyle w:val="ListParagraph"/>
         <w:numPr>
           <w:ilvl w:val="0"/>
           <w:numId w:val="5"/>
@@ -2200,13 +2582,12 @@
           <w:sz w:val="28"/>
           <w:szCs w:val="28"/>
         </w:rPr>
-        <w:lastRenderedPageBreak/>
         <w:t>Lists:</w:t>
       </w:r>
     </w:p>
     <w:p>
       <w:pPr>
-        <w:pStyle w:val="Paragraphedeliste"/>
+        <w:pStyle w:val="ListParagraph"/>
         <w:numPr>
           <w:ilvl w:val="1"/>
           <w:numId w:val="3"/>
@@ -2280,7 +2661,7 @@
     </w:p>
     <w:p>
       <w:pPr>
-        <w:pStyle w:val="Paragraphedeliste"/>
+        <w:pStyle w:val="ListParagraph"/>
         <w:numPr>
           <w:ilvl w:val="1"/>
           <w:numId w:val="3"/>
@@ -2310,7 +2691,7 @@
     </w:p>
     <w:p>
       <w:pPr>
-        <w:pStyle w:val="Paragraphedeliste"/>
+        <w:pStyle w:val="ListParagraph"/>
         <w:numPr>
           <w:ilvl w:val="0"/>
           <w:numId w:val="3"/>
@@ -2336,7 +2717,7 @@
     </w:p>
     <w:p>
       <w:pPr>
-        <w:pStyle w:val="Paragraphedeliste"/>
+        <w:pStyle w:val="ListParagraph"/>
         <w:numPr>
           <w:ilvl w:val="0"/>
           <w:numId w:val="8"/>
@@ -2362,7 +2743,7 @@
     </w:p>
     <w:p>
       <w:pPr>
-        <w:pStyle w:val="Paragraphedeliste"/>
+        <w:pStyle w:val="ListParagraph"/>
         <w:numPr>
           <w:ilvl w:val="1"/>
           <w:numId w:val="3"/>
@@ -2376,7 +2757,7 @@
     </w:p>
     <w:p>
       <w:pPr>
-        <w:pStyle w:val="Paragraphedeliste"/>
+        <w:pStyle w:val="ListParagraph"/>
         <w:numPr>
           <w:ilvl w:val="0"/>
           <w:numId w:val="8"/>
@@ -2402,7 +2783,7 @@
     </w:p>
     <w:p>
       <w:pPr>
-        <w:pStyle w:val="Paragraphedeliste"/>
+        <w:pStyle w:val="ListParagraph"/>
         <w:numPr>
           <w:ilvl w:val="1"/>
           <w:numId w:val="3"/>
@@ -2416,7 +2797,7 @@
     </w:p>
     <w:p>
       <w:pPr>
-        <w:pStyle w:val="Paragraphedeliste"/>
+        <w:pStyle w:val="ListParagraph"/>
         <w:numPr>
           <w:ilvl w:val="0"/>
           <w:numId w:val="8"/>
@@ -2442,7 +2823,7 @@
     </w:p>
     <w:p>
       <w:pPr>
-        <w:pStyle w:val="Paragraphedeliste"/>
+        <w:pStyle w:val="ListParagraph"/>
         <w:numPr>
           <w:ilvl w:val="1"/>
           <w:numId w:val="3"/>
@@ -2463,7 +2844,7 @@
     </w:p>
     <w:p>
       <w:pPr>
-        <w:pStyle w:val="Paragraphedeliste"/>
+        <w:pStyle w:val="ListParagraph"/>
         <w:numPr>
           <w:ilvl w:val="0"/>
           <w:numId w:val="8"/>
@@ -2489,7 +2870,7 @@
     </w:p>
     <w:p>
       <w:pPr>
-        <w:pStyle w:val="Paragraphedeliste"/>
+        <w:pStyle w:val="ListParagraph"/>
         <w:numPr>
           <w:ilvl w:val="1"/>
           <w:numId w:val="3"/>
@@ -2510,7 +2891,7 @@
     </w:p>
     <w:p>
       <w:pPr>
-        <w:pStyle w:val="Paragraphedeliste"/>
+        <w:pStyle w:val="ListParagraph"/>
         <w:numPr>
           <w:ilvl w:val="0"/>
           <w:numId w:val="8"/>
@@ -2536,7 +2917,7 @@
     </w:p>
     <w:p>
       <w:pPr>
-        <w:pStyle w:val="Paragraphedeliste"/>
+        <w:pStyle w:val="ListParagraph"/>
         <w:numPr>
           <w:ilvl w:val="1"/>
           <w:numId w:val="3"/>
@@ -2557,7 +2938,7 @@
     </w:p>
     <w:p>
       <w:pPr>
-        <w:pStyle w:val="Paragraphedeliste"/>
+        <w:pStyle w:val="ListParagraph"/>
         <w:numPr>
           <w:ilvl w:val="0"/>
           <w:numId w:val="8"/>
@@ -2583,7 +2964,7 @@
     </w:p>
     <w:p>
       <w:pPr>
-        <w:pStyle w:val="Paragraphedeliste"/>
+        <w:pStyle w:val="ListParagraph"/>
         <w:numPr>
           <w:ilvl w:val="1"/>
           <w:numId w:val="3"/>
@@ -2604,7 +2985,7 @@
     </w:p>
     <w:p>
       <w:pPr>
-        <w:pStyle w:val="Paragraphedeliste"/>
+        <w:pStyle w:val="ListParagraph"/>
         <w:numPr>
           <w:ilvl w:val="0"/>
           <w:numId w:val="8"/>
@@ -2630,7 +3011,7 @@
     </w:p>
     <w:p>
       <w:pPr>
-        <w:pStyle w:val="Paragraphedeliste"/>
+        <w:pStyle w:val="ListParagraph"/>
         <w:numPr>
           <w:ilvl w:val="1"/>
           <w:numId w:val="3"/>
@@ -2651,7 +3032,7 @@
     </w:p>
     <w:p>
       <w:pPr>
-        <w:pStyle w:val="Paragraphedeliste"/>
+        <w:pStyle w:val="ListParagraph"/>
         <w:numPr>
           <w:ilvl w:val="0"/>
           <w:numId w:val="8"/>
@@ -2677,7 +3058,7 @@
     </w:p>
     <w:p>
       <w:pPr>
-        <w:pStyle w:val="Paragraphedeliste"/>
+        <w:pStyle w:val="ListParagraph"/>
         <w:numPr>
           <w:ilvl w:val="1"/>
           <w:numId w:val="3"/>
@@ -2698,7 +3079,7 @@
     </w:p>
     <w:p>
       <w:pPr>
-        <w:pStyle w:val="Paragraphedeliste"/>
+        <w:pStyle w:val="ListParagraph"/>
         <w:numPr>
           <w:ilvl w:val="0"/>
           <w:numId w:val="8"/>
@@ -2724,7 +3105,7 @@
     </w:p>
     <w:p>
       <w:pPr>
-        <w:pStyle w:val="Paragraphedeliste"/>
+        <w:pStyle w:val="ListParagraph"/>
         <w:numPr>
           <w:ilvl w:val="1"/>
           <w:numId w:val="3"/>
@@ -2745,7 +3126,7 @@
     </w:p>
     <w:p>
       <w:pPr>
-        <w:pStyle w:val="Paragraphedeliste"/>
+        <w:pStyle w:val="ListParagraph"/>
         <w:numPr>
           <w:ilvl w:val="0"/>
           <w:numId w:val="3"/>
@@ -2771,16 +3152,16 @@
     </w:p>
     <w:p>
       <w:pPr>
-        <w:pStyle w:val="Paragraphedeliste"/>
-        <w:numPr>
-          <w:ilvl w:val="1"/>
-          <w:numId w:val="3"/>
-        </w:numPr>
-      </w:pPr>
-    </w:p>
-    <w:p>
-      <w:pPr>
-        <w:pStyle w:val="Paragraphedeliste"/>
+        <w:pStyle w:val="ListParagraph"/>
+        <w:numPr>
+          <w:ilvl w:val="1"/>
+          <w:numId w:val="3"/>
+        </w:numPr>
+      </w:pPr>
+    </w:p>
+    <w:p>
+      <w:pPr>
+        <w:pStyle w:val="ListParagraph"/>
         <w:numPr>
           <w:ilvl w:val="0"/>
           <w:numId w:val="3"/>
@@ -2806,16 +3187,16 @@
     </w:p>
     <w:p>
       <w:pPr>
-        <w:pStyle w:val="Paragraphedeliste"/>
-        <w:numPr>
-          <w:ilvl w:val="1"/>
-          <w:numId w:val="3"/>
-        </w:numPr>
-      </w:pPr>
-    </w:p>
-    <w:p>
-      <w:pPr>
-        <w:pStyle w:val="Paragraphedeliste"/>
+        <w:pStyle w:val="ListParagraph"/>
+        <w:numPr>
+          <w:ilvl w:val="1"/>
+          <w:numId w:val="3"/>
+        </w:numPr>
+      </w:pPr>
+    </w:p>
+    <w:p>
+      <w:pPr>
+        <w:pStyle w:val="ListParagraph"/>
         <w:numPr>
           <w:ilvl w:val="0"/>
           <w:numId w:val="3"/>
@@ -2841,16 +3222,16 @@
     </w:p>
     <w:p>
       <w:pPr>
-        <w:pStyle w:val="Paragraphedeliste"/>
-        <w:numPr>
-          <w:ilvl w:val="1"/>
-          <w:numId w:val="3"/>
-        </w:numPr>
-      </w:pPr>
-    </w:p>
-    <w:p>
-      <w:pPr>
-        <w:pStyle w:val="Paragraphedeliste"/>
+        <w:pStyle w:val="ListParagraph"/>
+        <w:numPr>
+          <w:ilvl w:val="1"/>
+          <w:numId w:val="3"/>
+        </w:numPr>
+      </w:pPr>
+    </w:p>
+    <w:p>
+      <w:pPr>
+        <w:pStyle w:val="ListParagraph"/>
         <w:numPr>
           <w:ilvl w:val="0"/>
           <w:numId w:val="3"/>
@@ -2876,16 +3257,16 @@
     </w:p>
     <w:p>
       <w:pPr>
-        <w:pStyle w:val="Paragraphedeliste"/>
-        <w:numPr>
-          <w:ilvl w:val="1"/>
-          <w:numId w:val="3"/>
-        </w:numPr>
-      </w:pPr>
-    </w:p>
-    <w:p>
-      <w:pPr>
-        <w:pStyle w:val="Paragraphedeliste"/>
+        <w:pStyle w:val="ListParagraph"/>
+        <w:numPr>
+          <w:ilvl w:val="1"/>
+          <w:numId w:val="3"/>
+        </w:numPr>
+      </w:pPr>
+    </w:p>
+    <w:p>
+      <w:pPr>
+        <w:pStyle w:val="ListParagraph"/>
         <w:numPr>
           <w:ilvl w:val="0"/>
           <w:numId w:val="3"/>
@@ -2911,16 +3292,16 @@
     </w:p>
     <w:p>
       <w:pPr>
-        <w:pStyle w:val="Paragraphedeliste"/>
-        <w:numPr>
-          <w:ilvl w:val="1"/>
-          <w:numId w:val="3"/>
-        </w:numPr>
-      </w:pPr>
-    </w:p>
-    <w:p>
-      <w:pPr>
-        <w:pStyle w:val="Paragraphedeliste"/>
+        <w:pStyle w:val="ListParagraph"/>
+        <w:numPr>
+          <w:ilvl w:val="1"/>
+          <w:numId w:val="3"/>
+        </w:numPr>
+      </w:pPr>
+    </w:p>
+    <w:p>
+      <w:pPr>
+        <w:pStyle w:val="ListParagraph"/>
         <w:numPr>
           <w:ilvl w:val="0"/>
           <w:numId w:val="3"/>
@@ -2941,22 +3322,21 @@
           <w:sz w:val="36"/>
           <w:szCs w:val="36"/>
         </w:rPr>
-        <w:lastRenderedPageBreak/>
         <w:t>Javascript challenges part 1</w:t>
       </w:r>
     </w:p>
     <w:p>
       <w:pPr>
-        <w:pStyle w:val="Paragraphedeliste"/>
-        <w:numPr>
-          <w:ilvl w:val="1"/>
-          <w:numId w:val="3"/>
-        </w:numPr>
-      </w:pPr>
-    </w:p>
-    <w:p>
-      <w:pPr>
-        <w:pStyle w:val="Paragraphedeliste"/>
+        <w:pStyle w:val="ListParagraph"/>
+        <w:numPr>
+          <w:ilvl w:val="1"/>
+          <w:numId w:val="3"/>
+        </w:numPr>
+      </w:pPr>
+    </w:p>
+    <w:p>
+      <w:pPr>
+        <w:pStyle w:val="ListParagraph"/>
         <w:numPr>
           <w:ilvl w:val="0"/>
           <w:numId w:val="3"/>
@@ -3004,16 +3384,16 @@
     </w:p>
     <w:p>
       <w:pPr>
-        <w:pStyle w:val="Paragraphedeliste"/>
-        <w:numPr>
-          <w:ilvl w:val="1"/>
-          <w:numId w:val="3"/>
-        </w:numPr>
-      </w:pPr>
-    </w:p>
-    <w:p>
-      <w:pPr>
-        <w:pStyle w:val="Paragraphedeliste"/>
+        <w:pStyle w:val="ListParagraph"/>
+        <w:numPr>
+          <w:ilvl w:val="1"/>
+          <w:numId w:val="3"/>
+        </w:numPr>
+      </w:pPr>
+    </w:p>
+    <w:p>
+      <w:pPr>
+        <w:pStyle w:val="ListParagraph"/>
         <w:numPr>
           <w:ilvl w:val="0"/>
           <w:numId w:val="3"/>
@@ -3039,16 +3419,16 @@
     </w:p>
     <w:p>
       <w:pPr>
-        <w:pStyle w:val="Paragraphedeliste"/>
-        <w:numPr>
-          <w:ilvl w:val="1"/>
-          <w:numId w:val="3"/>
-        </w:numPr>
-      </w:pPr>
-    </w:p>
-    <w:p>
-      <w:pPr>
-        <w:pStyle w:val="Paragraphedeliste"/>
+        <w:pStyle w:val="ListParagraph"/>
+        <w:numPr>
+          <w:ilvl w:val="1"/>
+          <w:numId w:val="3"/>
+        </w:numPr>
+      </w:pPr>
+    </w:p>
+    <w:p>
+      <w:pPr>
+        <w:pStyle w:val="ListParagraph"/>
         <w:numPr>
           <w:ilvl w:val="0"/>
           <w:numId w:val="3"/>
@@ -3074,16 +3454,16 @@
     </w:p>
     <w:p>
       <w:pPr>
-        <w:pStyle w:val="Paragraphedeliste"/>
-        <w:numPr>
-          <w:ilvl w:val="1"/>
-          <w:numId w:val="3"/>
-        </w:numPr>
-      </w:pPr>
-    </w:p>
-    <w:p>
-      <w:pPr>
-        <w:pStyle w:val="Paragraphedeliste"/>
+        <w:pStyle w:val="ListParagraph"/>
+        <w:numPr>
+          <w:ilvl w:val="1"/>
+          <w:numId w:val="3"/>
+        </w:numPr>
+      </w:pPr>
+    </w:p>
+    <w:p>
+      <w:pPr>
+        <w:pStyle w:val="ListParagraph"/>
         <w:numPr>
           <w:ilvl w:val="0"/>
           <w:numId w:val="3"/>
@@ -3109,16 +3489,16 @@
     </w:p>
     <w:p>
       <w:pPr>
-        <w:pStyle w:val="Paragraphedeliste"/>
-        <w:numPr>
-          <w:ilvl w:val="1"/>
-          <w:numId w:val="3"/>
-        </w:numPr>
-      </w:pPr>
-    </w:p>
-    <w:p>
-      <w:pPr>
-        <w:pStyle w:val="Paragraphedeliste"/>
+        <w:pStyle w:val="ListParagraph"/>
+        <w:numPr>
+          <w:ilvl w:val="1"/>
+          <w:numId w:val="3"/>
+        </w:numPr>
+      </w:pPr>
+    </w:p>
+    <w:p>
+      <w:pPr>
+        <w:pStyle w:val="ListParagraph"/>
         <w:numPr>
           <w:ilvl w:val="0"/>
           <w:numId w:val="3"/>
@@ -3144,16 +3524,16 @@
     </w:p>
     <w:p>
       <w:pPr>
-        <w:pStyle w:val="Paragraphedeliste"/>
-        <w:numPr>
-          <w:ilvl w:val="1"/>
-          <w:numId w:val="3"/>
-        </w:numPr>
-      </w:pPr>
-    </w:p>
-    <w:p>
-      <w:pPr>
-        <w:pStyle w:val="Paragraphedeliste"/>
+        <w:pStyle w:val="ListParagraph"/>
+        <w:numPr>
+          <w:ilvl w:val="1"/>
+          <w:numId w:val="3"/>
+        </w:numPr>
+      </w:pPr>
+    </w:p>
+    <w:p>
+      <w:pPr>
+        <w:pStyle w:val="ListParagraph"/>
         <w:numPr>
           <w:ilvl w:val="0"/>
           <w:numId w:val="3"/>
@@ -3179,16 +3559,16 @@
     </w:p>
     <w:p>
       <w:pPr>
-        <w:pStyle w:val="Paragraphedeliste"/>
-        <w:numPr>
-          <w:ilvl w:val="1"/>
-          <w:numId w:val="3"/>
-        </w:numPr>
-      </w:pPr>
-    </w:p>
-    <w:p>
-      <w:pPr>
-        <w:pStyle w:val="Paragraphedeliste"/>
+        <w:pStyle w:val="ListParagraph"/>
+        <w:numPr>
+          <w:ilvl w:val="1"/>
+          <w:numId w:val="3"/>
+        </w:numPr>
+      </w:pPr>
+    </w:p>
+    <w:p>
+      <w:pPr>
+        <w:pStyle w:val="ListParagraph"/>
         <w:numPr>
           <w:ilvl w:val="0"/>
           <w:numId w:val="3"/>
@@ -3236,16 +3616,16 @@
     </w:p>
     <w:p>
       <w:pPr>
-        <w:pStyle w:val="Paragraphedeliste"/>
-        <w:numPr>
-          <w:ilvl w:val="1"/>
-          <w:numId w:val="3"/>
-        </w:numPr>
-      </w:pPr>
-    </w:p>
-    <w:p>
-      <w:pPr>
-        <w:pStyle w:val="Paragraphedeliste"/>
+        <w:pStyle w:val="ListParagraph"/>
+        <w:numPr>
+          <w:ilvl w:val="1"/>
+          <w:numId w:val="3"/>
+        </w:numPr>
+      </w:pPr>
+    </w:p>
+    <w:p>
+      <w:pPr>
+        <w:pStyle w:val="ListParagraph"/>
         <w:numPr>
           <w:ilvl w:val="0"/>
           <w:numId w:val="3"/>
@@ -3271,16 +3651,16 @@
     </w:p>
     <w:p>
       <w:pPr>
-        <w:pStyle w:val="Paragraphedeliste"/>
-        <w:numPr>
-          <w:ilvl w:val="1"/>
-          <w:numId w:val="3"/>
-        </w:numPr>
-      </w:pPr>
-    </w:p>
-    <w:p>
-      <w:pPr>
-        <w:pStyle w:val="Paragraphedeliste"/>
+        <w:pStyle w:val="ListParagraph"/>
+        <w:numPr>
+          <w:ilvl w:val="1"/>
+          <w:numId w:val="3"/>
+        </w:numPr>
+      </w:pPr>
+    </w:p>
+    <w:p>
+      <w:pPr>
+        <w:pStyle w:val="ListParagraph"/>
         <w:numPr>
           <w:ilvl w:val="0"/>
           <w:numId w:val="3"/>
@@ -3306,16 +3686,16 @@
     </w:p>
     <w:p>
       <w:pPr>
-        <w:pStyle w:val="Paragraphedeliste"/>
-        <w:numPr>
-          <w:ilvl w:val="1"/>
-          <w:numId w:val="3"/>
-        </w:numPr>
-      </w:pPr>
-    </w:p>
-    <w:p>
-      <w:pPr>
-        <w:pStyle w:val="Paragraphedeliste"/>
+        <w:pStyle w:val="ListParagraph"/>
+        <w:numPr>
+          <w:ilvl w:val="1"/>
+          <w:numId w:val="3"/>
+        </w:numPr>
+      </w:pPr>
+    </w:p>
+    <w:p>
+      <w:pPr>
+        <w:pStyle w:val="ListParagraph"/>
         <w:numPr>
           <w:ilvl w:val="0"/>
           <w:numId w:val="3"/>
@@ -3341,16 +3721,16 @@
     </w:p>
     <w:p>
       <w:pPr>
-        <w:pStyle w:val="Paragraphedeliste"/>
-        <w:numPr>
-          <w:ilvl w:val="1"/>
-          <w:numId w:val="3"/>
-        </w:numPr>
-      </w:pPr>
-    </w:p>
-    <w:p>
-      <w:pPr>
-        <w:pStyle w:val="Paragraphedeliste"/>
+        <w:pStyle w:val="ListParagraph"/>
+        <w:numPr>
+          <w:ilvl w:val="1"/>
+          <w:numId w:val="3"/>
+        </w:numPr>
+      </w:pPr>
+    </w:p>
+    <w:p>
+      <w:pPr>
+        <w:pStyle w:val="ListParagraph"/>
         <w:numPr>
           <w:ilvl w:val="0"/>
           <w:numId w:val="3"/>
@@ -3398,16 +3778,16 @@
     </w:p>
     <w:p>
       <w:pPr>
-        <w:pStyle w:val="Paragraphedeliste"/>
-        <w:numPr>
-          <w:ilvl w:val="1"/>
-          <w:numId w:val="3"/>
-        </w:numPr>
-      </w:pPr>
-    </w:p>
-    <w:p>
-      <w:pPr>
-        <w:pStyle w:val="Paragraphedeliste"/>
+        <w:pStyle w:val="ListParagraph"/>
+        <w:numPr>
+          <w:ilvl w:val="1"/>
+          <w:numId w:val="3"/>
+        </w:numPr>
+      </w:pPr>
+    </w:p>
+    <w:p>
+      <w:pPr>
+        <w:pStyle w:val="ListParagraph"/>
         <w:numPr>
           <w:ilvl w:val="0"/>
           <w:numId w:val="3"/>
@@ -3433,16 +3813,16 @@
     </w:p>
     <w:p>
       <w:pPr>
-        <w:pStyle w:val="Paragraphedeliste"/>
-        <w:numPr>
-          <w:ilvl w:val="1"/>
-          <w:numId w:val="3"/>
-        </w:numPr>
-      </w:pPr>
-    </w:p>
-    <w:p>
-      <w:pPr>
-        <w:pStyle w:val="Paragraphedeliste"/>
+        <w:pStyle w:val="ListParagraph"/>
+        <w:numPr>
+          <w:ilvl w:val="1"/>
+          <w:numId w:val="3"/>
+        </w:numPr>
+      </w:pPr>
+    </w:p>
+    <w:p>
+      <w:pPr>
+        <w:pStyle w:val="ListParagraph"/>
         <w:numPr>
           <w:ilvl w:val="0"/>
           <w:numId w:val="3"/>
@@ -3468,16 +3848,16 @@
     </w:p>
     <w:p>
       <w:pPr>
-        <w:pStyle w:val="Paragraphedeliste"/>
-        <w:numPr>
-          <w:ilvl w:val="1"/>
-          <w:numId w:val="3"/>
-        </w:numPr>
-      </w:pPr>
-    </w:p>
-    <w:p>
-      <w:pPr>
-        <w:pStyle w:val="Paragraphedeliste"/>
+        <w:pStyle w:val="ListParagraph"/>
+        <w:numPr>
+          <w:ilvl w:val="1"/>
+          <w:numId w:val="3"/>
+        </w:numPr>
+      </w:pPr>
+    </w:p>
+    <w:p>
+      <w:pPr>
+        <w:pStyle w:val="ListParagraph"/>
         <w:numPr>
           <w:ilvl w:val="0"/>
           <w:numId w:val="3"/>
@@ -3525,16 +3905,16 @@
     </w:p>
     <w:p>
       <w:pPr>
-        <w:pStyle w:val="Paragraphedeliste"/>
-        <w:numPr>
-          <w:ilvl w:val="1"/>
-          <w:numId w:val="3"/>
-        </w:numPr>
-      </w:pPr>
-    </w:p>
-    <w:p>
-      <w:pPr>
-        <w:pStyle w:val="Paragraphedeliste"/>
+        <w:pStyle w:val="ListParagraph"/>
+        <w:numPr>
+          <w:ilvl w:val="1"/>
+          <w:numId w:val="3"/>
+        </w:numPr>
+      </w:pPr>
+    </w:p>
+    <w:p>
+      <w:pPr>
+        <w:pStyle w:val="ListParagraph"/>
         <w:numPr>
           <w:ilvl w:val="0"/>
           <w:numId w:val="3"/>
@@ -3560,16 +3940,16 @@
     </w:p>
     <w:p>
       <w:pPr>
-        <w:pStyle w:val="Paragraphedeliste"/>
-        <w:numPr>
-          <w:ilvl w:val="1"/>
-          <w:numId w:val="3"/>
-        </w:numPr>
-      </w:pPr>
-    </w:p>
-    <w:p>
-      <w:pPr>
-        <w:pStyle w:val="Paragraphedeliste"/>
+        <w:pStyle w:val="ListParagraph"/>
+        <w:numPr>
+          <w:ilvl w:val="1"/>
+          <w:numId w:val="3"/>
+        </w:numPr>
+      </w:pPr>
+    </w:p>
+    <w:p>
+      <w:pPr>
+        <w:pStyle w:val="ListParagraph"/>
         <w:numPr>
           <w:ilvl w:val="0"/>
           <w:numId w:val="3"/>
@@ -3590,22 +3970,21 @@
           <w:sz w:val="36"/>
           <w:szCs w:val="36"/>
         </w:rPr>
-        <w:lastRenderedPageBreak/>
         <w:t xml:space="preserve">Writing SQL queries </w:t>
       </w:r>
     </w:p>
     <w:p>
       <w:pPr>
-        <w:pStyle w:val="Paragraphedeliste"/>
-        <w:numPr>
-          <w:ilvl w:val="1"/>
-          <w:numId w:val="3"/>
-        </w:numPr>
-      </w:pPr>
-    </w:p>
-    <w:p>
-      <w:pPr>
-        <w:pStyle w:val="Paragraphedeliste"/>
+        <w:pStyle w:val="ListParagraph"/>
+        <w:numPr>
+          <w:ilvl w:val="1"/>
+          <w:numId w:val="3"/>
+        </w:numPr>
+      </w:pPr>
+    </w:p>
+    <w:p>
+      <w:pPr>
+        <w:pStyle w:val="ListParagraph"/>
         <w:numPr>
           <w:ilvl w:val="0"/>
           <w:numId w:val="3"/>
@@ -3631,16 +4010,16 @@
     </w:p>
     <w:p>
       <w:pPr>
-        <w:pStyle w:val="Paragraphedeliste"/>
-        <w:numPr>
-          <w:ilvl w:val="1"/>
-          <w:numId w:val="3"/>
-        </w:numPr>
-      </w:pPr>
-    </w:p>
-    <w:p>
-      <w:pPr>
-        <w:pStyle w:val="Paragraphedeliste"/>
+        <w:pStyle w:val="ListParagraph"/>
+        <w:numPr>
+          <w:ilvl w:val="1"/>
+          <w:numId w:val="3"/>
+        </w:numPr>
+      </w:pPr>
+    </w:p>
+    <w:p>
+      <w:pPr>
+        <w:pStyle w:val="ListParagraph"/>
         <w:numPr>
           <w:ilvl w:val="0"/>
           <w:numId w:val="3"/>
@@ -3666,16 +4045,16 @@
     </w:p>
     <w:p>
       <w:pPr>
-        <w:pStyle w:val="Paragraphedeliste"/>
-        <w:numPr>
-          <w:ilvl w:val="1"/>
-          <w:numId w:val="3"/>
-        </w:numPr>
-      </w:pPr>
-    </w:p>
-    <w:p>
-      <w:pPr>
-        <w:pStyle w:val="Paragraphedeliste"/>
+        <w:pStyle w:val="ListParagraph"/>
+        <w:numPr>
+          <w:ilvl w:val="1"/>
+          <w:numId w:val="3"/>
+        </w:numPr>
+      </w:pPr>
+    </w:p>
+    <w:p>
+      <w:pPr>
+        <w:pStyle w:val="ListParagraph"/>
         <w:numPr>
           <w:ilvl w:val="0"/>
           <w:numId w:val="3"/>
@@ -3701,16 +4080,16 @@
     </w:p>
     <w:p>
       <w:pPr>
-        <w:pStyle w:val="Paragraphedeliste"/>
-        <w:numPr>
-          <w:ilvl w:val="1"/>
-          <w:numId w:val="3"/>
-        </w:numPr>
-      </w:pPr>
-    </w:p>
-    <w:p>
-      <w:pPr>
-        <w:pStyle w:val="Paragraphedeliste"/>
+        <w:pStyle w:val="ListParagraph"/>
+        <w:numPr>
+          <w:ilvl w:val="1"/>
+          <w:numId w:val="3"/>
+        </w:numPr>
+      </w:pPr>
+    </w:p>
+    <w:p>
+      <w:pPr>
+        <w:pStyle w:val="ListParagraph"/>
         <w:numPr>
           <w:ilvl w:val="0"/>
           <w:numId w:val="3"/>
@@ -3736,16 +4115,16 @@
     </w:p>
     <w:p>
       <w:pPr>
-        <w:pStyle w:val="Paragraphedeliste"/>
-        <w:numPr>
-          <w:ilvl w:val="1"/>
-          <w:numId w:val="3"/>
-        </w:numPr>
-      </w:pPr>
-    </w:p>
-    <w:p>
-      <w:pPr>
-        <w:pStyle w:val="Paragraphedeliste"/>
+        <w:pStyle w:val="ListParagraph"/>
+        <w:numPr>
+          <w:ilvl w:val="1"/>
+          <w:numId w:val="3"/>
+        </w:numPr>
+      </w:pPr>
+    </w:p>
+    <w:p>
+      <w:pPr>
+        <w:pStyle w:val="ListParagraph"/>
         <w:numPr>
           <w:ilvl w:val="0"/>
           <w:numId w:val="3"/>
@@ -3771,16 +4150,16 @@
     </w:p>
     <w:p>
       <w:pPr>
-        <w:pStyle w:val="Paragraphedeliste"/>
-        <w:numPr>
-          <w:ilvl w:val="1"/>
-          <w:numId w:val="3"/>
-        </w:numPr>
-      </w:pPr>
-    </w:p>
-    <w:p>
-      <w:pPr>
-        <w:pStyle w:val="Paragraphedeliste"/>
+        <w:pStyle w:val="ListParagraph"/>
+        <w:numPr>
+          <w:ilvl w:val="1"/>
+          <w:numId w:val="3"/>
+        </w:numPr>
+      </w:pPr>
+    </w:p>
+    <w:p>
+      <w:pPr>
+        <w:pStyle w:val="ListParagraph"/>
         <w:numPr>
           <w:ilvl w:val="0"/>
           <w:numId w:val="3"/>
@@ -3806,16 +4185,16 @@
     </w:p>
     <w:p>
       <w:pPr>
-        <w:pStyle w:val="Paragraphedeliste"/>
-        <w:numPr>
-          <w:ilvl w:val="1"/>
-          <w:numId w:val="3"/>
-        </w:numPr>
-      </w:pPr>
-    </w:p>
-    <w:p>
-      <w:pPr>
-        <w:pStyle w:val="Paragraphedeliste"/>
+        <w:pStyle w:val="ListParagraph"/>
+        <w:numPr>
+          <w:ilvl w:val="1"/>
+          <w:numId w:val="3"/>
+        </w:numPr>
+      </w:pPr>
+    </w:p>
+    <w:p>
+      <w:pPr>
+        <w:pStyle w:val="ListParagraph"/>
         <w:numPr>
           <w:ilvl w:val="0"/>
           <w:numId w:val="3"/>
@@ -3841,16 +4220,16 @@
     </w:p>
     <w:p>
       <w:pPr>
-        <w:pStyle w:val="Paragraphedeliste"/>
-        <w:numPr>
-          <w:ilvl w:val="1"/>
-          <w:numId w:val="3"/>
-        </w:numPr>
-      </w:pPr>
-    </w:p>
-    <w:p>
-      <w:pPr>
-        <w:pStyle w:val="Paragraphedeliste"/>
+        <w:pStyle w:val="ListParagraph"/>
+        <w:numPr>
+          <w:ilvl w:val="1"/>
+          <w:numId w:val="3"/>
+        </w:numPr>
+      </w:pPr>
+    </w:p>
+    <w:p>
+      <w:pPr>
+        <w:pStyle w:val="ListParagraph"/>
         <w:numPr>
           <w:ilvl w:val="0"/>
           <w:numId w:val="3"/>
@@ -3876,16 +4255,16 @@
     </w:p>
     <w:p>
       <w:pPr>
-        <w:pStyle w:val="Paragraphedeliste"/>
-        <w:numPr>
-          <w:ilvl w:val="1"/>
-          <w:numId w:val="3"/>
-        </w:numPr>
-      </w:pPr>
-    </w:p>
-    <w:p>
-      <w:pPr>
-        <w:pStyle w:val="Paragraphedeliste"/>
+        <w:pStyle w:val="ListParagraph"/>
+        <w:numPr>
+          <w:ilvl w:val="1"/>
+          <w:numId w:val="3"/>
+        </w:numPr>
+      </w:pPr>
+    </w:p>
+    <w:p>
+      <w:pPr>
+        <w:pStyle w:val="ListParagraph"/>
         <w:numPr>
           <w:ilvl w:val="0"/>
           <w:numId w:val="3"/>
@@ -3911,7 +4290,7 @@
     </w:p>
     <w:p>
       <w:pPr>
-        <w:pStyle w:val="Paragraphedeliste"/>
+        <w:pStyle w:val="ListParagraph"/>
         <w:numPr>
           <w:ilvl w:val="1"/>
           <w:numId w:val="3"/>
@@ -3940,7 +4319,7 @@
 </file>
 
 <file path=word/numbering.xml><?xml version="1.0" encoding="utf-8"?>
-<w:numbering xmlns:wpc="http://schemas.microsoft.com/office/word/2010/wordprocessingCanvas" xmlns:cx="http://schemas.microsoft.com/office/drawing/2014/chartex" xmlns:cx1="http://schemas.microsoft.com/office/drawing/2015/9/8/chartex" xmlns:cx2="http://schemas.microsoft.com/office/drawing/2015/10/21/chartex" xmlns:cx3="http://schemas.microsoft.com/office/drawing/2016/5/9/chartex" xmlns:cx4="http://schemas.microsoft.com/office/drawing/2016/5/10/chartex" xmlns:cx5="http://schemas.microsoft.com/office/drawing/2016/5/11/chartex" xmlns:cx6="http://schemas.microsoft.com/office/drawing/2016/5/12/chartex" xmlns:cx7="http://schemas.microsoft.com/office/drawing/2016/5/13/chartex" xmlns:cx8="http://schemas.microsoft.com/office/drawing/2016/5/14/chartex" xmlns:mc="http://schemas.openxmlformats.org/markup-compatibility/2006" xmlns:aink="http://schemas.microsoft.com/office/drawing/2016/ink" xmlns:am3d="http://schemas.microsoft.com/office/drawing/2017/model3d" xmlns:o="urn:schemas-microsoft-com:office:office" xmlns:r="http://schemas.openxmlformats.org/officeDocument/2006/relationships" xmlns:m="http://schemas.openxmlformats.org/officeDocument/2006/math" xmlns:v="urn:schemas-microsoft-com:vml" xmlns:wp14="http://schemas.microsoft.com/office/word/2010/wordprocessingDrawing" xmlns:wp="http://schemas.openxmlformats.org/drawingml/2006/wordprocessingDrawing" xmlns:w10="urn:schemas-microsoft-com:office:word" xmlns:w="http://schemas.openxmlformats.org/wordprocessingml/2006/main" xmlns:w14="http://schemas.microsoft.com/office/word/2010/wordml" xmlns:w15="http://schemas.microsoft.com/office/word/2012/wordml" xmlns:w16cid="http://schemas.microsoft.com/office/word/2016/wordml/cid" xmlns:w16se="http://schemas.microsoft.com/office/word/2015/wordml/symex" xmlns:wpg="http://schemas.microsoft.com/office/word/2010/wordprocessingGroup" xmlns:wpi="http://schemas.microsoft.com/office/word/2010/wordprocessingInk" xmlns:wne="http://schemas.microsoft.com/office/word/2006/wordml" xmlns:wps="http://schemas.microsoft.com/office/word/2010/wordprocessingShape" mc:Ignorable="w14 w15 w16se w16cid wp14">
+<w:numbering xmlns:wpc="http://schemas.microsoft.com/office/word/2010/wordprocessingCanvas" xmlns:cx="http://schemas.microsoft.com/office/drawing/2014/chartex" xmlns:cx1="http://schemas.microsoft.com/office/drawing/2015/9/8/chartex" xmlns:cx2="http://schemas.microsoft.com/office/drawing/2015/10/21/chartex" xmlns:cx3="http://schemas.microsoft.com/office/drawing/2016/5/9/chartex" xmlns:cx4="http://schemas.microsoft.com/office/drawing/2016/5/10/chartex" xmlns:cx5="http://schemas.microsoft.com/office/drawing/2016/5/11/chartex" xmlns:cx6="http://schemas.microsoft.com/office/drawing/2016/5/12/chartex" xmlns:cx7="http://schemas.microsoft.com/office/drawing/2016/5/13/chartex" xmlns:cx8="http://schemas.microsoft.com/office/drawing/2016/5/14/chartex" xmlns:mc="http://schemas.openxmlformats.org/markup-compatibility/2006" xmlns:aink="http://schemas.microsoft.com/office/drawing/2016/ink" xmlns:am3d="http://schemas.microsoft.com/office/drawing/2017/model3d" xmlns:o="urn:schemas-microsoft-com:office:office" xmlns:oel="http://schemas.microsoft.com/office/2019/extlst" xmlns:r="http://schemas.openxmlformats.org/officeDocument/2006/relationships" xmlns:m="http://schemas.openxmlformats.org/officeDocument/2006/math" xmlns:v="urn:schemas-microsoft-com:vml" xmlns:wp14="http://schemas.microsoft.com/office/word/2010/wordprocessingDrawing" xmlns:wp="http://schemas.openxmlformats.org/drawingml/2006/wordprocessingDrawing" xmlns:w10="urn:schemas-microsoft-com:office:word" xmlns:w="http://schemas.openxmlformats.org/wordprocessingml/2006/main" xmlns:w14="http://schemas.microsoft.com/office/word/2010/wordml" xmlns:w15="http://schemas.microsoft.com/office/word/2012/wordml" xmlns:w16cex="http://schemas.microsoft.com/office/word/2018/wordml/cex" xmlns:w16cid="http://schemas.microsoft.com/office/word/2016/wordml/cid" xmlns:w16="http://schemas.microsoft.com/office/word/2018/wordml" xmlns:w16du="http://schemas.microsoft.com/office/word/2023/wordml/word16du" xmlns:w16sdtdh="http://schemas.microsoft.com/office/word/2020/wordml/sdtdatahash" xmlns:w16sdtfl="http://schemas.microsoft.com/office/word/2024/wordml/sdtformatlock" xmlns:w16se="http://schemas.microsoft.com/office/word/2015/wordml/symex" xmlns:wpg="http://schemas.microsoft.com/office/word/2010/wordprocessingGroup" xmlns:wpi="http://schemas.microsoft.com/office/word/2010/wordprocessingInk" xmlns:wne="http://schemas.microsoft.com/office/word/2006/wordml" xmlns:wps="http://schemas.microsoft.com/office/word/2010/wordprocessingShape" mc:Ignorable="w14 w15 w16se w16cid w16 w16cex w16sdtdh w16sdtfl w16du wp14">
   <w:abstractNum w:abstractNumId="0" w15:restartNumberingAfterBreak="0">
     <w:nsid w:val="049325C4"/>
     <w:multiLevelType w:val="multilevel"/>
@@ -4974,35 +5353,35 @@
       </w:pPr>
     </w:lvl>
   </w:abstractNum>
-  <w:num w:numId="1">
+  <w:num w:numId="1" w16cid:durableId="516773451">
     <w:abstractNumId w:val="4"/>
   </w:num>
-  <w:num w:numId="2">
+  <w:num w:numId="2" w16cid:durableId="844635567">
     <w:abstractNumId w:val="0"/>
   </w:num>
-  <w:num w:numId="3">
+  <w:num w:numId="3" w16cid:durableId="160778909">
     <w:abstractNumId w:val="3"/>
   </w:num>
-  <w:num w:numId="4">
+  <w:num w:numId="4" w16cid:durableId="534124959">
     <w:abstractNumId w:val="5"/>
   </w:num>
-  <w:num w:numId="5">
+  <w:num w:numId="5" w16cid:durableId="1319109637">
     <w:abstractNumId w:val="2"/>
   </w:num>
-  <w:num w:numId="6">
+  <w:num w:numId="6" w16cid:durableId="813837320">
     <w:abstractNumId w:val="1"/>
   </w:num>
-  <w:num w:numId="7">
+  <w:num w:numId="7" w16cid:durableId="249125568">
     <w:abstractNumId w:val="6"/>
   </w:num>
-  <w:num w:numId="8">
+  <w:num w:numId="8" w16cid:durableId="1972513314">
     <w:abstractNumId w:val="7"/>
   </w:num>
 </w:numbering>
 </file>
 
 <file path=word/styles.xml><?xml version="1.0" encoding="utf-8"?>
-<w:styles xmlns:mc="http://schemas.openxmlformats.org/markup-compatibility/2006" xmlns:r="http://schemas.openxmlformats.org/officeDocument/2006/relationships" xmlns:w="http://schemas.openxmlformats.org/wordprocessingml/2006/main" xmlns:w14="http://schemas.microsoft.com/office/word/2010/wordml" xmlns:w15="http://schemas.microsoft.com/office/word/2012/wordml" xmlns:w16cid="http://schemas.microsoft.com/office/word/2016/wordml/cid" xmlns:w16se="http://schemas.microsoft.com/office/word/2015/wordml/symex" mc:Ignorable="w14 w15 w16se w16cid">
+<w:styles xmlns:mc="http://schemas.openxmlformats.org/markup-compatibility/2006" xmlns:r="http://schemas.openxmlformats.org/officeDocument/2006/relationships" xmlns:w="http://schemas.openxmlformats.org/wordprocessingml/2006/main" xmlns:w14="http://schemas.microsoft.com/office/word/2010/wordml" xmlns:w15="http://schemas.microsoft.com/office/word/2012/wordml" xmlns:w16cex="http://schemas.microsoft.com/office/word/2018/wordml/cex" xmlns:w16cid="http://schemas.microsoft.com/office/word/2016/wordml/cid" xmlns:w16="http://schemas.microsoft.com/office/word/2018/wordml" xmlns:w16du="http://schemas.microsoft.com/office/word/2023/wordml/word16du" xmlns:w16sdtdh="http://schemas.microsoft.com/office/word/2020/wordml/sdtdatahash" xmlns:w16sdtfl="http://schemas.microsoft.com/office/word/2024/wordml/sdtformatlock" xmlns:w16se="http://schemas.microsoft.com/office/word/2015/wordml/symex" mc:Ignorable="w14 w15 w16se w16cid w16 w16cex w16sdtdh w16sdtfl w16du">
   <w:docDefaults>
     <w:rPrDefault>
       <w:rPr>
@@ -5402,11 +5781,11 @@
     <w:name w:val="Normal"/>
     <w:qFormat/>
   </w:style>
-  <w:style w:type="paragraph" w:styleId="Titre1">
+  <w:style w:type="paragraph" w:styleId="Heading1">
     <w:name w:val="heading 1"/>
     <w:basedOn w:val="Normal"/>
     <w:next w:val="Normal"/>
-    <w:link w:val="Titre1Car"/>
+    <w:link w:val="Heading1Char"/>
     <w:uiPriority w:val="9"/>
     <w:qFormat/>
     <w:rsid w:val="001E4A79"/>
@@ -5423,11 +5802,11 @@
       <w:szCs w:val="40"/>
     </w:rPr>
   </w:style>
-  <w:style w:type="paragraph" w:styleId="Titre2">
+  <w:style w:type="paragraph" w:styleId="Heading2">
     <w:name w:val="heading 2"/>
     <w:basedOn w:val="Normal"/>
     <w:next w:val="Normal"/>
-    <w:link w:val="Titre2Car"/>
+    <w:link w:val="Heading2Char"/>
     <w:uiPriority w:val="9"/>
     <w:semiHidden/>
     <w:unhideWhenUsed/>
@@ -5446,11 +5825,11 @@
       <w:szCs w:val="32"/>
     </w:rPr>
   </w:style>
-  <w:style w:type="paragraph" w:styleId="Titre3">
+  <w:style w:type="paragraph" w:styleId="Heading3">
     <w:name w:val="heading 3"/>
     <w:basedOn w:val="Normal"/>
     <w:next w:val="Normal"/>
-    <w:link w:val="Titre3Car"/>
+    <w:link w:val="Heading3Char"/>
     <w:uiPriority w:val="9"/>
     <w:semiHidden/>
     <w:unhideWhenUsed/>
@@ -5469,11 +5848,11 @@
       <w:szCs w:val="28"/>
     </w:rPr>
   </w:style>
-  <w:style w:type="paragraph" w:styleId="Titre4">
+  <w:style w:type="paragraph" w:styleId="Heading4">
     <w:name w:val="heading 4"/>
     <w:basedOn w:val="Normal"/>
     <w:next w:val="Normal"/>
-    <w:link w:val="Titre4Car"/>
+    <w:link w:val="Heading4Char"/>
     <w:uiPriority w:val="9"/>
     <w:semiHidden/>
     <w:unhideWhenUsed/>
@@ -5492,11 +5871,11 @@
       <w:color w:val="2F5496" w:themeColor="accent1" w:themeShade="BF"/>
     </w:rPr>
   </w:style>
-  <w:style w:type="paragraph" w:styleId="Titre5">
+  <w:style w:type="paragraph" w:styleId="Heading5">
     <w:name w:val="heading 5"/>
     <w:basedOn w:val="Normal"/>
     <w:next w:val="Normal"/>
-    <w:link w:val="Titre5Car"/>
+    <w:link w:val="Heading5Char"/>
     <w:uiPriority w:val="9"/>
     <w:semiHidden/>
     <w:unhideWhenUsed/>
@@ -5513,11 +5892,11 @@
       <w:color w:val="2F5496" w:themeColor="accent1" w:themeShade="BF"/>
     </w:rPr>
   </w:style>
-  <w:style w:type="paragraph" w:styleId="Titre6">
+  <w:style w:type="paragraph" w:styleId="Heading6">
     <w:name w:val="heading 6"/>
     <w:basedOn w:val="Normal"/>
     <w:next w:val="Normal"/>
-    <w:link w:val="Titre6Car"/>
+    <w:link w:val="Heading6Char"/>
     <w:uiPriority w:val="9"/>
     <w:semiHidden/>
     <w:unhideWhenUsed/>
@@ -5536,11 +5915,11 @@
       <w:color w:val="595959" w:themeColor="text1" w:themeTint="A6"/>
     </w:rPr>
   </w:style>
-  <w:style w:type="paragraph" w:styleId="Titre7">
+  <w:style w:type="paragraph" w:styleId="Heading7">
     <w:name w:val="heading 7"/>
     <w:basedOn w:val="Normal"/>
     <w:next w:val="Normal"/>
-    <w:link w:val="Titre7Car"/>
+    <w:link w:val="Heading7Char"/>
     <w:uiPriority w:val="9"/>
     <w:semiHidden/>
     <w:unhideWhenUsed/>
@@ -5557,11 +5936,11 @@
       <w:color w:val="595959" w:themeColor="text1" w:themeTint="A6"/>
     </w:rPr>
   </w:style>
-  <w:style w:type="paragraph" w:styleId="Titre8">
+  <w:style w:type="paragraph" w:styleId="Heading8">
     <w:name w:val="heading 8"/>
     <w:basedOn w:val="Normal"/>
     <w:next w:val="Normal"/>
-    <w:link w:val="Titre8Car"/>
+    <w:link w:val="Heading8Char"/>
     <w:uiPriority w:val="9"/>
     <w:semiHidden/>
     <w:unhideWhenUsed/>
@@ -5580,11 +5959,11 @@
       <w:color w:val="272727" w:themeColor="text1" w:themeTint="D8"/>
     </w:rPr>
   </w:style>
-  <w:style w:type="paragraph" w:styleId="Titre9">
+  <w:style w:type="paragraph" w:styleId="Heading9">
     <w:name w:val="heading 9"/>
     <w:basedOn w:val="Normal"/>
     <w:next w:val="Normal"/>
-    <w:link w:val="Titre9Car"/>
+    <w:link w:val="Heading9Char"/>
     <w:uiPriority w:val="9"/>
     <w:semiHidden/>
     <w:unhideWhenUsed/>
@@ -5601,13 +5980,13 @@
       <w:color w:val="272727" w:themeColor="text1" w:themeTint="D8"/>
     </w:rPr>
   </w:style>
-  <w:style w:type="character" w:default="1" w:styleId="Policepardfaut">
+  <w:style w:type="character" w:default="1" w:styleId="DefaultParagraphFont">
     <w:name w:val="Default Paragraph Font"/>
     <w:uiPriority w:val="1"/>
     <w:semiHidden/>
     <w:unhideWhenUsed/>
   </w:style>
-  <w:style w:type="table" w:default="1" w:styleId="TableauNormal">
+  <w:style w:type="table" w:default="1" w:styleId="TableNormal">
     <w:name w:val="Normal Table"/>
     <w:uiPriority w:val="99"/>
     <w:semiHidden/>
@@ -5622,16 +6001,16 @@
       </w:tblCellMar>
     </w:tblPr>
   </w:style>
-  <w:style w:type="numbering" w:default="1" w:styleId="Aucuneliste">
+  <w:style w:type="numbering" w:default="1" w:styleId="NoList">
     <w:name w:val="No List"/>
     <w:uiPriority w:val="99"/>
     <w:semiHidden/>
     <w:unhideWhenUsed/>
   </w:style>
-  <w:style w:type="character" w:customStyle="1" w:styleId="Titre1Car">
-    <w:name w:val="Titre 1 Car"/>
-    <w:basedOn w:val="Policepardfaut"/>
-    <w:link w:val="Titre1"/>
+  <w:style w:type="character" w:customStyle="1" w:styleId="Heading1Char">
+    <w:name w:val="Heading 1 Char"/>
+    <w:basedOn w:val="DefaultParagraphFont"/>
+    <w:link w:val="Heading1"/>
     <w:uiPriority w:val="9"/>
     <w:rsid w:val="001E4A79"/>
     <w:rPr>
@@ -5641,10 +6020,10 @@
       <w:szCs w:val="40"/>
     </w:rPr>
   </w:style>
-  <w:style w:type="character" w:customStyle="1" w:styleId="Titre2Car">
-    <w:name w:val="Titre 2 Car"/>
-    <w:basedOn w:val="Policepardfaut"/>
-    <w:link w:val="Titre2"/>
+  <w:style w:type="character" w:customStyle="1" w:styleId="Heading2Char">
+    <w:name w:val="Heading 2 Char"/>
+    <w:basedOn w:val="DefaultParagraphFont"/>
+    <w:link w:val="Heading2"/>
     <w:uiPriority w:val="9"/>
     <w:semiHidden/>
     <w:rsid w:val="001E4A79"/>
@@ -5655,10 +6034,10 @@
       <w:szCs w:val="32"/>
     </w:rPr>
   </w:style>
-  <w:style w:type="character" w:customStyle="1" w:styleId="Titre3Car">
-    <w:name w:val="Titre 3 Car"/>
-    <w:basedOn w:val="Policepardfaut"/>
-    <w:link w:val="Titre3"/>
+  <w:style w:type="character" w:customStyle="1" w:styleId="Heading3Char">
+    <w:name w:val="Heading 3 Char"/>
+    <w:basedOn w:val="DefaultParagraphFont"/>
+    <w:link w:val="Heading3"/>
     <w:uiPriority w:val="9"/>
     <w:semiHidden/>
     <w:rsid w:val="001E4A79"/>
@@ -5669,10 +6048,10 @@
       <w:szCs w:val="28"/>
     </w:rPr>
   </w:style>
-  <w:style w:type="character" w:customStyle="1" w:styleId="Titre4Car">
-    <w:name w:val="Titre 4 Car"/>
-    <w:basedOn w:val="Policepardfaut"/>
-    <w:link w:val="Titre4"/>
+  <w:style w:type="character" w:customStyle="1" w:styleId="Heading4Char">
+    <w:name w:val="Heading 4 Char"/>
+    <w:basedOn w:val="DefaultParagraphFont"/>
+    <w:link w:val="Heading4"/>
     <w:uiPriority w:val="9"/>
     <w:semiHidden/>
     <w:rsid w:val="001E4A79"/>
@@ -5683,10 +6062,10 @@
       <w:color w:val="2F5496" w:themeColor="accent1" w:themeShade="BF"/>
     </w:rPr>
   </w:style>
-  <w:style w:type="character" w:customStyle="1" w:styleId="Titre5Car">
-    <w:name w:val="Titre 5 Car"/>
-    <w:basedOn w:val="Policepardfaut"/>
-    <w:link w:val="Titre5"/>
+  <w:style w:type="character" w:customStyle="1" w:styleId="Heading5Char">
+    <w:name w:val="Heading 5 Char"/>
+    <w:basedOn w:val="DefaultParagraphFont"/>
+    <w:link w:val="Heading5"/>
     <w:uiPriority w:val="9"/>
     <w:semiHidden/>
     <w:rsid w:val="001E4A79"/>
@@ -5695,10 +6074,10 @@
       <w:color w:val="2F5496" w:themeColor="accent1" w:themeShade="BF"/>
     </w:rPr>
   </w:style>
-  <w:style w:type="character" w:customStyle="1" w:styleId="Titre6Car">
-    <w:name w:val="Titre 6 Car"/>
-    <w:basedOn w:val="Policepardfaut"/>
-    <w:link w:val="Titre6"/>
+  <w:style w:type="character" w:customStyle="1" w:styleId="Heading6Char">
+    <w:name w:val="Heading 6 Char"/>
+    <w:basedOn w:val="DefaultParagraphFont"/>
+    <w:link w:val="Heading6"/>
     <w:uiPriority w:val="9"/>
     <w:semiHidden/>
     <w:rsid w:val="001E4A79"/>
@@ -5709,10 +6088,10 @@
       <w:color w:val="595959" w:themeColor="text1" w:themeTint="A6"/>
     </w:rPr>
   </w:style>
-  <w:style w:type="character" w:customStyle="1" w:styleId="Titre7Car">
-    <w:name w:val="Titre 7 Car"/>
-    <w:basedOn w:val="Policepardfaut"/>
-    <w:link w:val="Titre7"/>
+  <w:style w:type="character" w:customStyle="1" w:styleId="Heading7Char">
+    <w:name w:val="Heading 7 Char"/>
+    <w:basedOn w:val="DefaultParagraphFont"/>
+    <w:link w:val="Heading7"/>
     <w:uiPriority w:val="9"/>
     <w:semiHidden/>
     <w:rsid w:val="001E4A79"/>
@@ -5721,10 +6100,10 @@
       <w:color w:val="595959" w:themeColor="text1" w:themeTint="A6"/>
     </w:rPr>
   </w:style>
-  <w:style w:type="character" w:customStyle="1" w:styleId="Titre8Car">
-    <w:name w:val="Titre 8 Car"/>
-    <w:basedOn w:val="Policepardfaut"/>
-    <w:link w:val="Titre8"/>
+  <w:style w:type="character" w:customStyle="1" w:styleId="Heading8Char">
+    <w:name w:val="Heading 8 Char"/>
+    <w:basedOn w:val="DefaultParagraphFont"/>
+    <w:link w:val="Heading8"/>
     <w:uiPriority w:val="9"/>
     <w:semiHidden/>
     <w:rsid w:val="001E4A79"/>
@@ -5735,10 +6114,10 @@
       <w:color w:val="272727" w:themeColor="text1" w:themeTint="D8"/>
     </w:rPr>
   </w:style>
-  <w:style w:type="character" w:customStyle="1" w:styleId="Titre9Car">
-    <w:name w:val="Titre 9 Car"/>
-    <w:basedOn w:val="Policepardfaut"/>
-    <w:link w:val="Titre9"/>
+  <w:style w:type="character" w:customStyle="1" w:styleId="Heading9Char">
+    <w:name w:val="Heading 9 Char"/>
+    <w:basedOn w:val="DefaultParagraphFont"/>
+    <w:link w:val="Heading9"/>
     <w:uiPriority w:val="9"/>
     <w:semiHidden/>
     <w:rsid w:val="001E4A79"/>
@@ -5747,11 +6126,11 @@
       <w:color w:val="272727" w:themeColor="text1" w:themeTint="D8"/>
     </w:rPr>
   </w:style>
-  <w:style w:type="paragraph" w:styleId="Titre">
+  <w:style w:type="paragraph" w:styleId="Title">
     <w:name w:val="Title"/>
     <w:basedOn w:val="Normal"/>
     <w:next w:val="Normal"/>
-    <w:link w:val="TitreCar"/>
+    <w:link w:val="TitleChar"/>
     <w:uiPriority w:val="10"/>
     <w:qFormat/>
     <w:rsid w:val="001E4A79"/>
@@ -5767,10 +6146,10 @@
       <w:szCs w:val="56"/>
     </w:rPr>
   </w:style>
-  <w:style w:type="character" w:customStyle="1" w:styleId="TitreCar">
-    <w:name w:val="Titre Car"/>
-    <w:basedOn w:val="Policepardfaut"/>
-    <w:link w:val="Titre"/>
+  <w:style w:type="character" w:customStyle="1" w:styleId="TitleChar">
+    <w:name w:val="Title Char"/>
+    <w:basedOn w:val="DefaultParagraphFont"/>
+    <w:link w:val="Title"/>
     <w:uiPriority w:val="10"/>
     <w:rsid w:val="001E4A79"/>
     <w:rPr>
@@ -5781,11 +6160,11 @@
       <w:szCs w:val="56"/>
     </w:rPr>
   </w:style>
-  <w:style w:type="paragraph" w:styleId="Sous-titre">
+  <w:style w:type="paragraph" w:styleId="Subtitle">
     <w:name w:val="Subtitle"/>
     <w:basedOn w:val="Normal"/>
     <w:next w:val="Normal"/>
-    <w:link w:val="Sous-titreCar"/>
+    <w:link w:val="SubtitleChar"/>
     <w:uiPriority w:val="11"/>
     <w:qFormat/>
     <w:rsid w:val="001E4A79"/>
@@ -5802,10 +6181,10 @@
       <w:szCs w:val="28"/>
     </w:rPr>
   </w:style>
-  <w:style w:type="character" w:customStyle="1" w:styleId="Sous-titreCar">
-    <w:name w:val="Sous-titre Car"/>
-    <w:basedOn w:val="Policepardfaut"/>
-    <w:link w:val="Sous-titre"/>
+  <w:style w:type="character" w:customStyle="1" w:styleId="SubtitleChar">
+    <w:name w:val="Subtitle Char"/>
+    <w:basedOn w:val="DefaultParagraphFont"/>
+    <w:link w:val="Subtitle"/>
     <w:uiPriority w:val="11"/>
     <w:rsid w:val="001E4A79"/>
     <w:rPr>
@@ -5816,11 +6195,11 @@
       <w:szCs w:val="28"/>
     </w:rPr>
   </w:style>
-  <w:style w:type="paragraph" w:styleId="Citation">
+  <w:style w:type="paragraph" w:styleId="Quote">
     <w:name w:val="Quote"/>
     <w:basedOn w:val="Normal"/>
     <w:next w:val="Normal"/>
-    <w:link w:val="CitationCar"/>
+    <w:link w:val="QuoteChar"/>
     <w:uiPriority w:val="29"/>
     <w:qFormat/>
     <w:rsid w:val="001E4A79"/>
@@ -5834,10 +6213,10 @@
       <w:color w:val="404040" w:themeColor="text1" w:themeTint="BF"/>
     </w:rPr>
   </w:style>
-  <w:style w:type="character" w:customStyle="1" w:styleId="CitationCar">
-    <w:name w:val="Citation Car"/>
-    <w:basedOn w:val="Policepardfaut"/>
-    <w:link w:val="Citation"/>
+  <w:style w:type="character" w:customStyle="1" w:styleId="QuoteChar">
+    <w:name w:val="Quote Char"/>
+    <w:basedOn w:val="DefaultParagraphFont"/>
+    <w:link w:val="Quote"/>
     <w:uiPriority w:val="29"/>
     <w:rsid w:val="001E4A79"/>
     <w:rPr>
@@ -5846,7 +6225,7 @@
       <w:color w:val="404040" w:themeColor="text1" w:themeTint="BF"/>
     </w:rPr>
   </w:style>
-  <w:style w:type="paragraph" w:styleId="Paragraphedeliste">
+  <w:style w:type="paragraph" w:styleId="ListParagraph">
     <w:name w:val="List Paragraph"/>
     <w:basedOn w:val="Normal"/>
     <w:uiPriority w:val="34"/>
@@ -5857,9 +6236,9 @@
       <w:contextualSpacing/>
     </w:pPr>
   </w:style>
-  <w:style w:type="character" w:styleId="Accentuationintense">
+  <w:style w:type="character" w:styleId="IntenseEmphasis">
     <w:name w:val="Intense Emphasis"/>
-    <w:basedOn w:val="Policepardfaut"/>
+    <w:basedOn w:val="DefaultParagraphFont"/>
     <w:uiPriority w:val="21"/>
     <w:qFormat/>
     <w:rsid w:val="001E4A79"/>
@@ -5869,11 +6248,11 @@
       <w:color w:val="2F5496" w:themeColor="accent1" w:themeShade="BF"/>
     </w:rPr>
   </w:style>
-  <w:style w:type="paragraph" w:styleId="Citationintense">
+  <w:style w:type="paragraph" w:styleId="IntenseQuote">
     <w:name w:val="Intense Quote"/>
     <w:basedOn w:val="Normal"/>
     <w:next w:val="Normal"/>
-    <w:link w:val="CitationintenseCar"/>
+    <w:link w:val="IntenseQuoteChar"/>
     <w:uiPriority w:val="30"/>
     <w:qFormat/>
     <w:rsid w:val="001E4A79"/>
@@ -5892,10 +6271,10 @@
       <w:color w:val="2F5496" w:themeColor="accent1" w:themeShade="BF"/>
     </w:rPr>
   </w:style>
-  <w:style w:type="character" w:customStyle="1" w:styleId="CitationintenseCar">
-    <w:name w:val="Citation intense Car"/>
-    <w:basedOn w:val="Policepardfaut"/>
-    <w:link w:val="Citationintense"/>
+  <w:style w:type="character" w:customStyle="1" w:styleId="IntenseQuoteChar">
+    <w:name w:val="Intense Quote Char"/>
+    <w:basedOn w:val="DefaultParagraphFont"/>
+    <w:link w:val="IntenseQuote"/>
     <w:uiPriority w:val="30"/>
     <w:rsid w:val="001E4A79"/>
     <w:rPr>
@@ -5904,9 +6283,9 @@
       <w:color w:val="2F5496" w:themeColor="accent1" w:themeShade="BF"/>
     </w:rPr>
   </w:style>
-  <w:style w:type="character" w:styleId="Rfrenceintense">
+  <w:style w:type="character" w:styleId="IntenseReference">
     <w:name w:val="Intense Reference"/>
-    <w:basedOn w:val="Policepardfaut"/>
+    <w:basedOn w:val="DefaultParagraphFont"/>
     <w:uiPriority w:val="32"/>
     <w:qFormat/>
     <w:rsid w:val="001E4A79"/>
@@ -5918,9 +6297,9 @@
       <w:spacing w:val="5"/>
     </w:rPr>
   </w:style>
-  <w:style w:type="character" w:styleId="Lienhypertexte">
+  <w:style w:type="character" w:styleId="Hyperlink">
     <w:name w:val="Hyperlink"/>
-    <w:basedOn w:val="Policepardfaut"/>
+    <w:basedOn w:val="DefaultParagraphFont"/>
     <w:uiPriority w:val="99"/>
     <w:unhideWhenUsed/>
     <w:rsid w:val="007D5D55"/>
@@ -5929,9 +6308,9 @@
       <w:u w:val="single"/>
     </w:rPr>
   </w:style>
-  <w:style w:type="character" w:styleId="Mentionnonrsolue">
+  <w:style w:type="character" w:styleId="UnresolvedMention">
     <w:name w:val="Unresolved Mention"/>
-    <w:basedOn w:val="Policepardfaut"/>
+    <w:basedOn w:val="DefaultParagraphFont"/>
     <w:uiPriority w:val="99"/>
     <w:semiHidden/>
     <w:unhideWhenUsed/>
@@ -5941,9 +6320,9 @@
       <w:shd w:val="clear" w:color="auto" w:fill="E1DFDD"/>
     </w:rPr>
   </w:style>
-  <w:style w:type="character" w:styleId="CodeHTML">
+  <w:style w:type="character" w:styleId="HTMLCode">
     <w:name w:val="HTML Code"/>
-    <w:basedOn w:val="Policepardfaut"/>
+    <w:basedOn w:val="DefaultParagraphFont"/>
     <w:uiPriority w:val="99"/>
     <w:semiHidden/>
     <w:unhideWhenUsed/>

</xml_diff>